<commit_message>
feat: v2.1.2 — jednotky zákazníka ve všech třech aplikacích (audit X1, X4, X5, X8)
- services/units.py: jednotka z hlavičky CSV → mN / mΩ / mA; starší soubory ([N], [Ohm])
  převedeny, chybné hlavičky Electric_Current [A] / Measuring_BasePeriod [ms] bez převodu
- /api/data (position_scale), XLSX s hlavičkami [mN]/[mOhm], /api/signal (force_mn, r_*_mohm,
  polohy v souřadnicích tabulky, C = TTP + max x); X8: TTP = maximum, OP od FP
- frontend: mN celé, µm 0,1, mΩ 0,1, ∞ jen u odporu > 999,9; grafy v mN / mΩ, hystereze
  s obrácenou osou; poznámka u starších souborů (PositionScaleNote); popisky drah FP → OP
- test napříč aplikacemi test_ecosystem_units.py (Analyzing → Gateway → API), test_units.py
- uživatelský manuál CS/EN přegenerován (verze z __init__.py), dokumentace

Testy: backend 345, frontend 120, tsc 0, lint 0. Nasazovat s Analyzing ≥ 6dd2b6b a Gateway 2026-10-11.

Co-Authored-By: Claude Opus 5.5 <noreply@anthropic.com>
</commit_message>
<xml_diff>
--- a/04_docs/manual/ScadaViewer_User_Manual_EN.docx
+++ b/04_docs/manual/ScadaViewer_User_Manual_EN.docx
@@ -216,7 +216,7 @@
                 <w:bCs/>
                 <w:color w:val="161C2D"/>
               </w:rPr>
-              <w:t>2.1.0</w:t>
+              <w:t>2.1.2</w:t>
             </w:r>
           </w:p>
         </w:tc>
@@ -341,7 +341,7 @@
     <w:sdt>
       <w:sdtPr>
         <w:alias w:val="Contents"/>
-        <w:id w:val="-1483696055"/>
+        <w:id w:val="1192572391"/>
       </w:sdtPr>
       <w:sdtEndPr/>
       <w:sdtContent>
@@ -370,7 +370,7 @@
           <w:r>
             <w:fldChar w:fldCharType="separate"/>
           </w:r>
-          <w:hyperlink w:anchor="_Toc242522628" w:history="1">
+          <w:hyperlink w:anchor="_Toc242612424" w:history="1">
             <w:r>
               <w:rPr>
                 <w:rStyle w:val="Hypertextovodkaz"/>
@@ -394,7 +394,7 @@
               <w:rPr>
                 <w:noProof/>
               </w:rPr>
-              <w:instrText xml:space="preserve"> PAGEREF _Toc242522628 \h </w:instrText>
+              <w:instrText xml:space="preserve"> PAGEREF _Toc242612424 \h </w:instrText>
             </w:r>
             <w:r>
               <w:rPr>
@@ -437,7 +437,7 @@
               <w14:ligatures w14:val="standardContextual"/>
             </w:rPr>
           </w:pPr>
-          <w:hyperlink w:anchor="_Toc242522629" w:history="1">
+          <w:hyperlink w:anchor="_Toc242612425" w:history="1">
             <w:r>
               <w:rPr>
                 <w:rStyle w:val="Hypertextovodkaz"/>
@@ -461,7 +461,7 @@
               <w:rPr>
                 <w:noProof/>
               </w:rPr>
-              <w:instrText xml:space="preserve"> PAGEREF _Toc242522629 \h </w:instrText>
+              <w:instrText xml:space="preserve"> PAGEREF _Toc242612425 \h </w:instrText>
             </w:r>
             <w:r>
               <w:rPr>
@@ -504,7 +504,7 @@
               <w14:ligatures w14:val="standardContextual"/>
             </w:rPr>
           </w:pPr>
-          <w:hyperlink w:anchor="_Toc242522630" w:history="1">
+          <w:hyperlink w:anchor="_Toc242612426" w:history="1">
             <w:r>
               <w:rPr>
                 <w:rStyle w:val="Hypertextovodkaz"/>
@@ -528,7 +528,7 @@
               <w:rPr>
                 <w:noProof/>
               </w:rPr>
-              <w:instrText xml:space="preserve"> PAGEREF _Toc242522630 \h </w:instrText>
+              <w:instrText xml:space="preserve"> PAGEREF _Toc242612426 \h </w:instrText>
             </w:r>
             <w:r>
               <w:rPr>
@@ -571,7 +571,7 @@
               <w14:ligatures w14:val="standardContextual"/>
             </w:rPr>
           </w:pPr>
-          <w:hyperlink w:anchor="_Toc242522631" w:history="1">
+          <w:hyperlink w:anchor="_Toc242612427" w:history="1">
             <w:r>
               <w:rPr>
                 <w:rStyle w:val="Hypertextovodkaz"/>
@@ -595,7 +595,7 @@
               <w:rPr>
                 <w:noProof/>
               </w:rPr>
-              <w:instrText xml:space="preserve"> PAGEREF _Toc242522631 \h </w:instrText>
+              <w:instrText xml:space="preserve"> PAGEREF _Toc242612427 \h </w:instrText>
             </w:r>
             <w:r>
               <w:rPr>
@@ -638,7 +638,7 @@
               <w14:ligatures w14:val="standardContextual"/>
             </w:rPr>
           </w:pPr>
-          <w:hyperlink w:anchor="_Toc242522632" w:history="1">
+          <w:hyperlink w:anchor="_Toc242612428" w:history="1">
             <w:r>
               <w:rPr>
                 <w:rStyle w:val="Hypertextovodkaz"/>
@@ -662,7 +662,7 @@
               <w:rPr>
                 <w:noProof/>
               </w:rPr>
-              <w:instrText xml:space="preserve"> PAGEREF _Toc242522632 \h </w:instrText>
+              <w:instrText xml:space="preserve"> PAGEREF _Toc242612428 \h </w:instrText>
             </w:r>
             <w:r>
               <w:rPr>
@@ -705,7 +705,7 @@
               <w14:ligatures w14:val="standardContextual"/>
             </w:rPr>
           </w:pPr>
-          <w:hyperlink w:anchor="_Toc242522633" w:history="1">
+          <w:hyperlink w:anchor="_Toc242612429" w:history="1">
             <w:r>
               <w:rPr>
                 <w:rStyle w:val="Hypertextovodkaz"/>
@@ -729,7 +729,7 @@
               <w:rPr>
                 <w:noProof/>
               </w:rPr>
-              <w:instrText xml:space="preserve"> PAGEREF _Toc242522633 \h </w:instrText>
+              <w:instrText xml:space="preserve"> PAGEREF _Toc242612429 \h </w:instrText>
             </w:r>
             <w:r>
               <w:rPr>
@@ -772,7 +772,7 @@
               <w14:ligatures w14:val="standardContextual"/>
             </w:rPr>
           </w:pPr>
-          <w:hyperlink w:anchor="_Toc242522634" w:history="1">
+          <w:hyperlink w:anchor="_Toc242612430" w:history="1">
             <w:r>
               <w:rPr>
                 <w:rStyle w:val="Hypertextovodkaz"/>
@@ -796,7 +796,7 @@
               <w:rPr>
                 <w:noProof/>
               </w:rPr>
-              <w:instrText xml:space="preserve"> PAGEREF _Toc242522634 \h </w:instrText>
+              <w:instrText xml:space="preserve"> PAGEREF _Toc242612430 \h </w:instrText>
             </w:r>
             <w:r>
               <w:rPr>
@@ -839,7 +839,7 @@
               <w14:ligatures w14:val="standardContextual"/>
             </w:rPr>
           </w:pPr>
-          <w:hyperlink w:anchor="_Toc242522635" w:history="1">
+          <w:hyperlink w:anchor="_Toc242612431" w:history="1">
             <w:r>
               <w:rPr>
                 <w:rStyle w:val="Hypertextovodkaz"/>
@@ -863,7 +863,7 @@
               <w:rPr>
                 <w:noProof/>
               </w:rPr>
-              <w:instrText xml:space="preserve"> PAGEREF _Toc242522635 \h </w:instrText>
+              <w:instrText xml:space="preserve"> PAGEREF _Toc242612431 \h </w:instrText>
             </w:r>
             <w:r>
               <w:rPr>
@@ -906,7 +906,7 @@
               <w14:ligatures w14:val="standardContextual"/>
             </w:rPr>
           </w:pPr>
-          <w:hyperlink w:anchor="_Toc242522636" w:history="1">
+          <w:hyperlink w:anchor="_Toc242612432" w:history="1">
             <w:r>
               <w:rPr>
                 <w:rStyle w:val="Hypertextovodkaz"/>
@@ -930,7 +930,7 @@
               <w:rPr>
                 <w:noProof/>
               </w:rPr>
-              <w:instrText xml:space="preserve"> PAGEREF _Toc242522636 \h </w:instrText>
+              <w:instrText xml:space="preserve"> PAGEREF _Toc242612432 \h </w:instrText>
             </w:r>
             <w:r>
               <w:rPr>
@@ -973,7 +973,7 @@
               <w14:ligatures w14:val="standardContextual"/>
             </w:rPr>
           </w:pPr>
-          <w:hyperlink w:anchor="_Toc242522637" w:history="1">
+          <w:hyperlink w:anchor="_Toc242612433" w:history="1">
             <w:r>
               <w:rPr>
                 <w:rStyle w:val="Hypertextovodkaz"/>
@@ -997,7 +997,7 @@
               <w:rPr>
                 <w:noProof/>
               </w:rPr>
-              <w:instrText xml:space="preserve"> PAGEREF _Toc242522637 \h </w:instrText>
+              <w:instrText xml:space="preserve"> PAGEREF _Toc242612433 \h </w:instrText>
             </w:r>
             <w:r>
               <w:rPr>
@@ -1040,7 +1040,7 @@
               <w14:ligatures w14:val="standardContextual"/>
             </w:rPr>
           </w:pPr>
-          <w:hyperlink w:anchor="_Toc242522638" w:history="1">
+          <w:hyperlink w:anchor="_Toc242612434" w:history="1">
             <w:r>
               <w:rPr>
                 <w:rStyle w:val="Hypertextovodkaz"/>
@@ -1064,7 +1064,7 @@
               <w:rPr>
                 <w:noProof/>
               </w:rPr>
-              <w:instrText xml:space="preserve"> PAGEREF _Toc242522638 \h </w:instrText>
+              <w:instrText xml:space="preserve"> PAGEREF _Toc242612434 \h </w:instrText>
             </w:r>
             <w:r>
               <w:rPr>
@@ -1107,7 +1107,7 @@
               <w14:ligatures w14:val="standardContextual"/>
             </w:rPr>
           </w:pPr>
-          <w:hyperlink w:anchor="_Toc242522639" w:history="1">
+          <w:hyperlink w:anchor="_Toc242612435" w:history="1">
             <w:r>
               <w:rPr>
                 <w:rStyle w:val="Hypertextovodkaz"/>
@@ -1131,7 +1131,7 @@
               <w:rPr>
                 <w:noProof/>
               </w:rPr>
-              <w:instrText xml:space="preserve"> PAGEREF _Toc242522639 \h </w:instrText>
+              <w:instrText xml:space="preserve"> PAGEREF _Toc242612435 \h </w:instrText>
             </w:r>
             <w:r>
               <w:rPr>
@@ -1174,7 +1174,7 @@
               <w14:ligatures w14:val="standardContextual"/>
             </w:rPr>
           </w:pPr>
-          <w:hyperlink w:anchor="_Toc242522640" w:history="1">
+          <w:hyperlink w:anchor="_Toc242612436" w:history="1">
             <w:r>
               <w:rPr>
                 <w:rStyle w:val="Hypertextovodkaz"/>
@@ -1198,7 +1198,7 @@
               <w:rPr>
                 <w:noProof/>
               </w:rPr>
-              <w:instrText xml:space="preserve"> PAGEREF _Toc242522640 \h </w:instrText>
+              <w:instrText xml:space="preserve"> PAGEREF _Toc242612436 \h </w:instrText>
             </w:r>
             <w:r>
               <w:rPr>
@@ -1241,7 +1241,7 @@
               <w14:ligatures w14:val="standardContextual"/>
             </w:rPr>
           </w:pPr>
-          <w:hyperlink w:anchor="_Toc242522641" w:history="1">
+          <w:hyperlink w:anchor="_Toc242612437" w:history="1">
             <w:r>
               <w:rPr>
                 <w:rStyle w:val="Hypertextovodkaz"/>
@@ -1265,7 +1265,7 @@
               <w:rPr>
                 <w:noProof/>
               </w:rPr>
-              <w:instrText xml:space="preserve"> PAGEREF _Toc242522641 \h </w:instrText>
+              <w:instrText xml:space="preserve"> PAGEREF _Toc242612437 \h </w:instrText>
             </w:r>
             <w:r>
               <w:rPr>
@@ -1308,7 +1308,7 @@
               <w14:ligatures w14:val="standardContextual"/>
             </w:rPr>
           </w:pPr>
-          <w:hyperlink w:anchor="_Toc242522642" w:history="1">
+          <w:hyperlink w:anchor="_Toc242612438" w:history="1">
             <w:r>
               <w:rPr>
                 <w:rStyle w:val="Hypertextovodkaz"/>
@@ -1332,7 +1332,7 @@
               <w:rPr>
                 <w:noProof/>
               </w:rPr>
-              <w:instrText xml:space="preserve"> PAGEREF _Toc242522642 \h </w:instrText>
+              <w:instrText xml:space="preserve"> PAGEREF _Toc242612438 \h </w:instrText>
             </w:r>
             <w:r>
               <w:rPr>
@@ -1375,7 +1375,7 @@
               <w14:ligatures w14:val="standardContextual"/>
             </w:rPr>
           </w:pPr>
-          <w:hyperlink w:anchor="_Toc242522643" w:history="1">
+          <w:hyperlink w:anchor="_Toc242612439" w:history="1">
             <w:r>
               <w:rPr>
                 <w:rStyle w:val="Hypertextovodkaz"/>
@@ -1399,7 +1399,7 @@
               <w:rPr>
                 <w:noProof/>
               </w:rPr>
-              <w:instrText xml:space="preserve"> PAGEREF _Toc242522643 \h </w:instrText>
+              <w:instrText xml:space="preserve"> PAGEREF _Toc242612439 \h </w:instrText>
             </w:r>
             <w:r>
               <w:rPr>
@@ -1442,7 +1442,7 @@
               <w14:ligatures w14:val="standardContextual"/>
             </w:rPr>
           </w:pPr>
-          <w:hyperlink w:anchor="_Toc242522644" w:history="1">
+          <w:hyperlink w:anchor="_Toc242612440" w:history="1">
             <w:r>
               <w:rPr>
                 <w:rStyle w:val="Hypertextovodkaz"/>
@@ -1466,7 +1466,7 @@
               <w:rPr>
                 <w:noProof/>
               </w:rPr>
-              <w:instrText xml:space="preserve"> PAGEREF _Toc242522644 \h </w:instrText>
+              <w:instrText xml:space="preserve"> PAGEREF _Toc242612440 \h </w:instrText>
             </w:r>
             <w:r>
               <w:rPr>
@@ -1509,7 +1509,7 @@
               <w14:ligatures w14:val="standardContextual"/>
             </w:rPr>
           </w:pPr>
-          <w:hyperlink w:anchor="_Toc242522645" w:history="1">
+          <w:hyperlink w:anchor="_Toc242612441" w:history="1">
             <w:r>
               <w:rPr>
                 <w:rStyle w:val="Hypertextovodkaz"/>
@@ -1533,7 +1533,7 @@
               <w:rPr>
                 <w:noProof/>
               </w:rPr>
-              <w:instrText xml:space="preserve"> PAGEREF _Toc242522645 \h </w:instrText>
+              <w:instrText xml:space="preserve"> PAGEREF _Toc242612441 \h </w:instrText>
             </w:r>
             <w:r>
               <w:rPr>
@@ -1576,7 +1576,7 @@
               <w14:ligatures w14:val="standardContextual"/>
             </w:rPr>
           </w:pPr>
-          <w:hyperlink w:anchor="_Toc242522646" w:history="1">
+          <w:hyperlink w:anchor="_Toc242612442" w:history="1">
             <w:r>
               <w:rPr>
                 <w:rStyle w:val="Hypertextovodkaz"/>
@@ -1600,7 +1600,7 @@
               <w:rPr>
                 <w:noProof/>
               </w:rPr>
-              <w:instrText xml:space="preserve"> PAGEREF _Toc242522646 \h </w:instrText>
+              <w:instrText xml:space="preserve"> PAGEREF _Toc242612442 \h </w:instrText>
             </w:r>
             <w:r>
               <w:rPr>
@@ -1643,7 +1643,7 @@
               <w14:ligatures w14:val="standardContextual"/>
             </w:rPr>
           </w:pPr>
-          <w:hyperlink w:anchor="_Toc242522647" w:history="1">
+          <w:hyperlink w:anchor="_Toc242612443" w:history="1">
             <w:r>
               <w:rPr>
                 <w:rStyle w:val="Hypertextovodkaz"/>
@@ -1667,7 +1667,7 @@
               <w:rPr>
                 <w:noProof/>
               </w:rPr>
-              <w:instrText xml:space="preserve"> PAGEREF _Toc242522647 \h </w:instrText>
+              <w:instrText xml:space="preserve"> PAGEREF _Toc242612443 \h </w:instrText>
             </w:r>
             <w:r>
               <w:rPr>
@@ -1710,7 +1710,7 @@
               <w14:ligatures w14:val="standardContextual"/>
             </w:rPr>
           </w:pPr>
-          <w:hyperlink w:anchor="_Toc242522648" w:history="1">
+          <w:hyperlink w:anchor="_Toc242612444" w:history="1">
             <w:r>
               <w:rPr>
                 <w:rStyle w:val="Hypertextovodkaz"/>
@@ -1734,7 +1734,7 @@
               <w:rPr>
                 <w:noProof/>
               </w:rPr>
-              <w:instrText xml:space="preserve"> PAGEREF _Toc242522648 \h </w:instrText>
+              <w:instrText xml:space="preserve"> PAGEREF _Toc242612444 \h </w:instrText>
             </w:r>
             <w:r>
               <w:rPr>
@@ -1777,7 +1777,7 @@
               <w14:ligatures w14:val="standardContextual"/>
             </w:rPr>
           </w:pPr>
-          <w:hyperlink w:anchor="_Toc242522649" w:history="1">
+          <w:hyperlink w:anchor="_Toc242612445" w:history="1">
             <w:r>
               <w:rPr>
                 <w:rStyle w:val="Hypertextovodkaz"/>
@@ -1801,7 +1801,7 @@
               <w:rPr>
                 <w:noProof/>
               </w:rPr>
-              <w:instrText xml:space="preserve"> PAGEREF _Toc242522649 \h </w:instrText>
+              <w:instrText xml:space="preserve"> PAGEREF _Toc242612445 \h </w:instrText>
             </w:r>
             <w:r>
               <w:rPr>
@@ -1844,7 +1844,7 @@
               <w14:ligatures w14:val="standardContextual"/>
             </w:rPr>
           </w:pPr>
-          <w:hyperlink w:anchor="_Toc242522650" w:history="1">
+          <w:hyperlink w:anchor="_Toc242612446" w:history="1">
             <w:r>
               <w:rPr>
                 <w:rStyle w:val="Hypertextovodkaz"/>
@@ -1868,7 +1868,7 @@
               <w:rPr>
                 <w:noProof/>
               </w:rPr>
-              <w:instrText xml:space="preserve"> PAGEREF _Toc242522650 \h </w:instrText>
+              <w:instrText xml:space="preserve"> PAGEREF _Toc242612446 \h </w:instrText>
             </w:r>
             <w:r>
               <w:rPr>
@@ -1911,7 +1911,7 @@
               <w14:ligatures w14:val="standardContextual"/>
             </w:rPr>
           </w:pPr>
-          <w:hyperlink w:anchor="_Toc242522651" w:history="1">
+          <w:hyperlink w:anchor="_Toc242612447" w:history="1">
             <w:r>
               <w:rPr>
                 <w:rStyle w:val="Hypertextovodkaz"/>
@@ -1935,7 +1935,7 @@
               <w:rPr>
                 <w:noProof/>
               </w:rPr>
-              <w:instrText xml:space="preserve"> PAGEREF _Toc242522651 \h </w:instrText>
+              <w:instrText xml:space="preserve"> PAGEREF _Toc242612447 \h </w:instrText>
             </w:r>
             <w:r>
               <w:rPr>
@@ -1978,7 +1978,7 @@
               <w14:ligatures w14:val="standardContextual"/>
             </w:rPr>
           </w:pPr>
-          <w:hyperlink w:anchor="_Toc242522652" w:history="1">
+          <w:hyperlink w:anchor="_Toc242612448" w:history="1">
             <w:r>
               <w:rPr>
                 <w:rStyle w:val="Hypertextovodkaz"/>
@@ -2002,7 +2002,7 @@
               <w:rPr>
                 <w:noProof/>
               </w:rPr>
-              <w:instrText xml:space="preserve"> PAGEREF _Toc242522652 \h </w:instrText>
+              <w:instrText xml:space="preserve"> PAGEREF _Toc242612448 \h </w:instrText>
             </w:r>
             <w:r>
               <w:rPr>
@@ -2045,7 +2045,7 @@
               <w14:ligatures w14:val="standardContextual"/>
             </w:rPr>
           </w:pPr>
-          <w:hyperlink w:anchor="_Toc242522653" w:history="1">
+          <w:hyperlink w:anchor="_Toc242612449" w:history="1">
             <w:r>
               <w:rPr>
                 <w:rStyle w:val="Hypertextovodkaz"/>
@@ -2069,7 +2069,7 @@
               <w:rPr>
                 <w:noProof/>
               </w:rPr>
-              <w:instrText xml:space="preserve"> PAGEREF _Toc242522653 \h </w:instrText>
+              <w:instrText xml:space="preserve"> PAGEREF _Toc242612449 \h </w:instrText>
             </w:r>
             <w:r>
               <w:rPr>
@@ -2112,7 +2112,7 @@
               <w14:ligatures w14:val="standardContextual"/>
             </w:rPr>
           </w:pPr>
-          <w:hyperlink w:anchor="_Toc242522654" w:history="1">
+          <w:hyperlink w:anchor="_Toc242612450" w:history="1">
             <w:r>
               <w:rPr>
                 <w:rStyle w:val="Hypertextovodkaz"/>
@@ -2136,7 +2136,7 @@
               <w:rPr>
                 <w:noProof/>
               </w:rPr>
-              <w:instrText xml:space="preserve"> PAGEREF _Toc242522654 \h </w:instrText>
+              <w:instrText xml:space="preserve"> PAGEREF _Toc242612450 \h </w:instrText>
             </w:r>
             <w:r>
               <w:rPr>
@@ -2179,7 +2179,7 @@
               <w14:ligatures w14:val="standardContextual"/>
             </w:rPr>
           </w:pPr>
-          <w:hyperlink w:anchor="_Toc242522655" w:history="1">
+          <w:hyperlink w:anchor="_Toc242612451" w:history="1">
             <w:r>
               <w:rPr>
                 <w:rStyle w:val="Hypertextovodkaz"/>
@@ -2203,7 +2203,7 @@
               <w:rPr>
                 <w:noProof/>
               </w:rPr>
-              <w:instrText xml:space="preserve"> PAGEREF _Toc242522655 \h </w:instrText>
+              <w:instrText xml:space="preserve"> PAGEREF _Toc242612451 \h </w:instrText>
             </w:r>
             <w:r>
               <w:rPr>
@@ -2246,7 +2246,7 @@
               <w14:ligatures w14:val="standardContextual"/>
             </w:rPr>
           </w:pPr>
-          <w:hyperlink w:anchor="_Toc242522656" w:history="1">
+          <w:hyperlink w:anchor="_Toc242612452" w:history="1">
             <w:r>
               <w:rPr>
                 <w:rStyle w:val="Hypertextovodkaz"/>
@@ -2270,7 +2270,7 @@
               <w:rPr>
                 <w:noProof/>
               </w:rPr>
-              <w:instrText xml:space="preserve"> PAGEREF _Toc242522656 \h </w:instrText>
+              <w:instrText xml:space="preserve"> PAGEREF _Toc242612452 \h </w:instrText>
             </w:r>
             <w:r>
               <w:rPr>
@@ -2313,7 +2313,7 @@
               <w14:ligatures w14:val="standardContextual"/>
             </w:rPr>
           </w:pPr>
-          <w:hyperlink w:anchor="_Toc242522657" w:history="1">
+          <w:hyperlink w:anchor="_Toc242612453" w:history="1">
             <w:r>
               <w:rPr>
                 <w:rStyle w:val="Hypertextovodkaz"/>
@@ -2337,7 +2337,7 @@
               <w:rPr>
                 <w:noProof/>
               </w:rPr>
-              <w:instrText xml:space="preserve"> PAGEREF _Toc242522657 \h </w:instrText>
+              <w:instrText xml:space="preserve"> PAGEREF _Toc242612453 \h </w:instrText>
             </w:r>
             <w:r>
               <w:rPr>
@@ -2380,7 +2380,7 @@
               <w14:ligatures w14:val="standardContextual"/>
             </w:rPr>
           </w:pPr>
-          <w:hyperlink w:anchor="_Toc242522658" w:history="1">
+          <w:hyperlink w:anchor="_Toc242612454" w:history="1">
             <w:r>
               <w:rPr>
                 <w:rStyle w:val="Hypertextovodkaz"/>
@@ -2404,7 +2404,7 @@
               <w:rPr>
                 <w:noProof/>
               </w:rPr>
-              <w:instrText xml:space="preserve"> PAGEREF _Toc242522658 \h </w:instrText>
+              <w:instrText xml:space="preserve"> PAGEREF _Toc242612454 \h </w:instrText>
             </w:r>
             <w:r>
               <w:rPr>
@@ -2447,7 +2447,7 @@
               <w14:ligatures w14:val="standardContextual"/>
             </w:rPr>
           </w:pPr>
-          <w:hyperlink w:anchor="_Toc242522659" w:history="1">
+          <w:hyperlink w:anchor="_Toc242612455" w:history="1">
             <w:r>
               <w:rPr>
                 <w:rStyle w:val="Hypertextovodkaz"/>
@@ -2471,7 +2471,7 @@
               <w:rPr>
                 <w:noProof/>
               </w:rPr>
-              <w:instrText xml:space="preserve"> PAGEREF _Toc242522659 \h </w:instrText>
+              <w:instrText xml:space="preserve"> PAGEREF _Toc242612455 \h </w:instrText>
             </w:r>
             <w:r>
               <w:rPr>
@@ -2514,7 +2514,7 @@
               <w14:ligatures w14:val="standardContextual"/>
             </w:rPr>
           </w:pPr>
-          <w:hyperlink w:anchor="_Toc242522660" w:history="1">
+          <w:hyperlink w:anchor="_Toc242612456" w:history="1">
             <w:r>
               <w:rPr>
                 <w:rStyle w:val="Hypertextovodkaz"/>
@@ -2538,7 +2538,7 @@
               <w:rPr>
                 <w:noProof/>
               </w:rPr>
-              <w:instrText xml:space="preserve"> PAGEREF _Toc242522660 \h </w:instrText>
+              <w:instrText xml:space="preserve"> PAGEREF _Toc242612456 \h </w:instrText>
             </w:r>
             <w:r>
               <w:rPr>
@@ -2581,7 +2581,7 @@
               <w14:ligatures w14:val="standardContextual"/>
             </w:rPr>
           </w:pPr>
-          <w:hyperlink w:anchor="_Toc242522661" w:history="1">
+          <w:hyperlink w:anchor="_Toc242612457" w:history="1">
             <w:r>
               <w:rPr>
                 <w:rStyle w:val="Hypertextovodkaz"/>
@@ -2605,7 +2605,7 @@
               <w:rPr>
                 <w:noProof/>
               </w:rPr>
-              <w:instrText xml:space="preserve"> PAGEREF _Toc242522661 \h </w:instrText>
+              <w:instrText xml:space="preserve"> PAGEREF _Toc242612457 \h </w:instrText>
             </w:r>
             <w:r>
               <w:rPr>
@@ -2654,7 +2654,7 @@
         <w:pStyle w:val="Nadpis1"/>
         <w:pageBreakBefore/>
       </w:pPr>
-      <w:bookmarkStart w:id="0" w:name="_Toc242522628"/>
+      <w:bookmarkStart w:id="0" w:name="_Toc242612424"/>
       <w:r>
         <w:t>1  Introduction</w:t>
       </w:r>
@@ -2664,7 +2664,7 @@
       <w:pPr>
         <w:pStyle w:val="Nadpis2"/>
       </w:pPr>
-      <w:bookmarkStart w:id="1" w:name="_Toc242522629"/>
+      <w:bookmarkStart w:id="1" w:name="_Toc242612425"/>
       <w:r>
         <w:t>1.1  What the application is for</w:t>
       </w:r>
@@ -2835,7 +2835,7 @@
       <w:pPr>
         <w:pStyle w:val="Nadpis2"/>
       </w:pPr>
-      <w:bookmarkStart w:id="2" w:name="_Toc242522630"/>
+      <w:bookmarkStart w:id="2" w:name="_Toc242612426"/>
       <w:r>
         <w:t>1.2  Where the application runs and how to open it</w:t>
       </w:r>
@@ -2905,7 +2905,7 @@
       <w:pPr>
         <w:pStyle w:val="Nadpis2"/>
       </w:pPr>
-      <w:bookmarkStart w:id="3" w:name="_Toc242522631"/>
+      <w:bookmarkStart w:id="3" w:name="_Toc242612427"/>
       <w:r>
         <w:t>1.3  User roles</w:t>
       </w:r>
@@ -4293,7 +4293,7 @@
       <w:pPr>
         <w:pStyle w:val="Nadpis2"/>
       </w:pPr>
-      <w:bookmarkStart w:id="4" w:name="_Toc242522632"/>
+      <w:bookmarkStart w:id="4" w:name="_Toc242612428"/>
       <w:r>
         <w:t>1.4  About this manual</w:t>
       </w:r>
@@ -4312,7 +4312,7 @@
         <w:pStyle w:val="Nadpis1"/>
         <w:pageBreakBefore/>
       </w:pPr>
-      <w:bookmarkStart w:id="5" w:name="_Toc242522633"/>
+      <w:bookmarkStart w:id="5" w:name="_Toc242612429"/>
       <w:r>
         <w:t>2  Sign-in and basic controls</w:t>
       </w:r>
@@ -4322,7 +4322,7 @@
       <w:pPr>
         <w:pStyle w:val="Nadpis2"/>
       </w:pPr>
-      <w:bookmarkStart w:id="6" w:name="_Toc242522634"/>
+      <w:bookmarkStart w:id="6" w:name="_Toc242612430"/>
       <w:r>
         <w:t>2.1  Signing in</w:t>
       </w:r>
@@ -4339,7 +4339,7 @@
           <w:noProof/>
         </w:rPr>
         <w:drawing>
-          <wp:inline distT="0" distB="0" distL="0" distR="0" wp14:anchorId="15CE9CEF" wp14:editId="326728E2">
+          <wp:inline distT="0" distB="0" distL="0" distR="0" wp14:anchorId="624881E1" wp14:editId="12AB86E5">
             <wp:extent cx="3800475" cy="2133600"/>
             <wp:effectExtent l="0" t="0" r="0" b="0"/>
             <wp:docPr id="1" name="01_login" descr="Sign-in screen" title="Sign-in screen"/>
@@ -4472,7 +4472,7 @@
       <w:pPr>
         <w:pStyle w:val="Nadpis2"/>
       </w:pPr>
-      <w:bookmarkStart w:id="7" w:name="_Toc242522635"/>
+      <w:bookmarkStart w:id="7" w:name="_Toc242612431"/>
       <w:r>
         <w:t>2.2  Top bar</w:t>
       </w:r>
@@ -4489,7 +4489,7 @@
           <w:noProof/>
         </w:rPr>
         <w:drawing>
-          <wp:inline distT="0" distB="0" distL="0" distR="0" wp14:anchorId="3A983873" wp14:editId="7CBA5F27">
+          <wp:inline distT="0" distB="0" distL="0" distR="0" wp14:anchorId="5962BB6F" wp14:editId="3BBD6CAA">
             <wp:extent cx="6124575" cy="209550"/>
             <wp:effectExtent l="0" t="0" r="0" b="0"/>
             <wp:docPr id="2" name="02b_topbar" descr="Top bar" title="Top bar"/>
@@ -5196,7 +5196,7 @@
       <w:pPr>
         <w:pStyle w:val="Nadpis2"/>
       </w:pPr>
-      <w:bookmarkStart w:id="8" w:name="_Toc242522636"/>
+      <w:bookmarkStart w:id="8" w:name="_Toc242612432"/>
       <w:r>
         <w:t>2.3  Menu and controls</w:t>
       </w:r>
@@ -5298,7 +5298,7 @@
         <w:pStyle w:val="Nadpis1"/>
         <w:pageBreakBefore/>
       </w:pPr>
-      <w:bookmarkStart w:id="9" w:name="_Toc242522637"/>
+      <w:bookmarkStart w:id="9" w:name="_Toc242612433"/>
       <w:r>
         <w:t>3  Database</w:t>
       </w:r>
@@ -5323,7 +5323,7 @@
           <w:noProof/>
         </w:rPr>
         <w:drawing>
-          <wp:inline distT="0" distB="0" distL="0" distR="0" wp14:anchorId="14E15108" wp14:editId="22EE6F1C">
+          <wp:inline distT="0" distB="0" distL="0" distR="0" wp14:anchorId="6CFE7957" wp14:editId="7981F8A9">
             <wp:extent cx="6124575" cy="3448050"/>
             <wp:effectExtent l="0" t="0" r="0" b="0"/>
             <wp:docPr id="3" name="02_database" descr="Database — orders on the machine PC" title="Database — orders on the machine PC"/>
@@ -5390,7 +5390,7 @@
       <w:pPr>
         <w:pStyle w:val="Nadpis2"/>
       </w:pPr>
-      <w:bookmarkStart w:id="10" w:name="_Toc242522638"/>
+      <w:bookmarkStart w:id="10" w:name="_Toc242612434"/>
       <w:r>
         <w:t>3.1  Order list</w:t>
       </w:r>
@@ -6233,7 +6233,7 @@
       <w:pPr>
         <w:pStyle w:val="Nadpis2"/>
       </w:pPr>
-      <w:bookmarkStart w:id="11" w:name="_Toc242522639"/>
+      <w:bookmarkStart w:id="11" w:name="_Toc242612435"/>
       <w:r>
         <w:t>3.2  Switches, date filter and sorting</w:t>
       </w:r>
@@ -6250,7 +6250,7 @@
           <w:noProof/>
         </w:rPr>
         <w:drawing>
-          <wp:inline distT="0" distB="0" distL="0" distR="0" wp14:anchorId="3029386D" wp14:editId="38666A5E">
+          <wp:inline distT="0" distB="0" distL="0" distR="0" wp14:anchorId="0A2D678E" wp14:editId="0AEA6551">
             <wp:extent cx="6124575" cy="342900"/>
             <wp:effectExtent l="0" t="0" r="0" b="0"/>
             <wp:docPr id="4" name="02d_controls" descr="Database header: storage indicator and switches" title="Database header: storage indicator and switches"/>
@@ -6447,7 +6447,7 @@
       <w:pPr>
         <w:pStyle w:val="Nadpis2"/>
       </w:pPr>
-      <w:bookmarkStart w:id="12" w:name="_Toc242522640"/>
+      <w:bookmarkStart w:id="12" w:name="_Toc242612436"/>
       <w:r>
         <w:t>3.3  Expanding an order</w:t>
       </w:r>
@@ -6482,7 +6482,7 @@
           <w:noProof/>
         </w:rPr>
         <w:drawing>
-          <wp:inline distT="0" distB="0" distL="0" distR="0" wp14:anchorId="4C0B578A" wp14:editId="6A2A163B">
+          <wp:inline distT="0" distB="0" distL="0" distR="0" wp14:anchorId="5D3D86C7" wp14:editId="1C685C88">
             <wp:extent cx="6124575" cy="3448050"/>
             <wp:effectExtent l="0" t="0" r="0" b="0"/>
             <wp:docPr id="5" name="03_expanded" descr="Order expanded in the list" title="Order expanded in the list"/>
@@ -6549,7 +6549,7 @@
       <w:pPr>
         <w:pStyle w:val="Nadpis2"/>
       </w:pPr>
-      <w:bookmarkStart w:id="13" w:name="_Toc242522641"/>
+      <w:bookmarkStart w:id="13" w:name="_Toc242612437"/>
       <w:r>
         <w:t>3.4  Downloading data</w:t>
       </w:r>
@@ -6599,7 +6599,7 @@
       <w:pPr>
         <w:pStyle w:val="Nadpis2"/>
       </w:pPr>
-      <w:bookmarkStart w:id="14" w:name="_Toc242522642"/>
+      <w:bookmarkStart w:id="14" w:name="_Toc242612438"/>
       <w:r>
         <w:t>3.5  Deleting files</w:t>
       </w:r>
@@ -6654,7 +6654,7 @@
           <w:noProof/>
         </w:rPr>
         <w:drawing>
-          <wp:inline distT="0" distB="0" distL="0" distR="0" wp14:anchorId="6BA3D21D" wp14:editId="06C085F8">
+          <wp:inline distT="0" distB="0" distL="0" distR="0" wp14:anchorId="6AB297E2" wp14:editId="6079A812">
             <wp:extent cx="6124575" cy="3448050"/>
             <wp:effectExtent l="0" t="0" r="0" b="0"/>
             <wp:docPr id="6" name="05_selection" descr="Selecting several files for batch deletion" title="Selecting several files for batch deletion"/>
@@ -6742,7 +6742,7 @@
       <w:pPr>
         <w:pStyle w:val="Nadpis2"/>
       </w:pPr>
-      <w:bookmarkStart w:id="15" w:name="_Toc242522643"/>
+      <w:bookmarkStart w:id="15" w:name="_Toc242612439"/>
       <w:r>
         <w:t>3.6  Remote storage (NAS)</w:t>
       </w:r>
@@ -6777,7 +6777,7 @@
           <w:noProof/>
         </w:rPr>
         <w:drawing>
-          <wp:inline distT="0" distB="0" distL="0" distR="0" wp14:anchorId="22E03012" wp14:editId="0DA0E621">
+          <wp:inline distT="0" distB="0" distL="0" distR="0" wp14:anchorId="363194C1" wp14:editId="27247E44">
             <wp:extent cx="6124575" cy="3448050"/>
             <wp:effectExtent l="0" t="0" r="0" b="0"/>
             <wp:docPr id="7" name="06_remote" descr="Orders on the NAS" title="Orders on the NAS"/>
@@ -6844,7 +6844,7 @@
       <w:pPr>
         <w:pStyle w:val="Nadpis2"/>
       </w:pPr>
-      <w:bookmarkStart w:id="16" w:name="_Toc242522644"/>
+      <w:bookmarkStart w:id="16" w:name="_Toc242612440"/>
       <w:r>
         <w:t>3.7  Local storage and clean-up</w:t>
       </w:r>
@@ -6861,7 +6861,7 @@
           <w:noProof/>
         </w:rPr>
         <w:drawing>
-          <wp:inline distT="0" distB="0" distL="0" distR="0" wp14:anchorId="70A92D51" wp14:editId="253C7882">
+          <wp:inline distT="0" distB="0" distL="0" distR="0" wp14:anchorId="3E0CBB7D" wp14:editId="09817A83">
             <wp:extent cx="2162175" cy="342900"/>
             <wp:effectExtent l="0" t="0" r="0" b="0"/>
             <wp:docPr id="8" name="04a_storagebar" descr="Local storage indicator" title="Local storage indicator"/>
@@ -7002,7 +7002,7 @@
           <w:noProof/>
         </w:rPr>
         <w:drawing>
-          <wp:inline distT="0" distB="0" distL="0" distR="0" wp14:anchorId="1BE7E547" wp14:editId="2A53844D">
+          <wp:inline distT="0" distB="0" distL="0" distR="0" wp14:anchorId="4745ADBC" wp14:editId="5726DD56">
             <wp:extent cx="2647950" cy="1981200"/>
             <wp:effectExtent l="0" t="0" r="0" b="0"/>
             <wp:docPr id="9" name="04_storage" descr="Confirming clean-up of synced files" title="Confirming clean-up of synced files"/>
@@ -7090,7 +7090,7 @@
       <w:pPr>
         <w:pStyle w:val="Nadpis2"/>
       </w:pPr>
-      <w:bookmarkStart w:id="17" w:name="_Toc242522645"/>
+      <w:bookmarkStart w:id="17" w:name="_Toc242612441"/>
       <w:r>
         <w:t>3.8  Tests (Testing)</w:t>
       </w:r>
@@ -7125,7 +7125,7 @@
           <w:noProof/>
         </w:rPr>
         <w:drawing>
-          <wp:inline distT="0" distB="0" distL="0" distR="0" wp14:anchorId="61073797" wp14:editId="6CEC8FD8">
+          <wp:inline distT="0" distB="0" distL="0" distR="0" wp14:anchorId="0906167F" wp14:editId="4999A8FA">
             <wp:extent cx="6124575" cy="3448050"/>
             <wp:effectExtent l="0" t="0" r="0" b="0"/>
             <wp:docPr id="10" name="07_testing_list" descr="Test list" title="Test list"/>
@@ -7193,7 +7193,7 @@
         <w:pStyle w:val="Nadpis1"/>
         <w:pageBreakBefore/>
       </w:pPr>
-      <w:bookmarkStart w:id="18" w:name="_Toc242522646"/>
+      <w:bookmarkStart w:id="18" w:name="_Toc242612442"/>
       <w:r>
         <w:t>4  Order detail</w:t>
       </w:r>
@@ -7238,7 +7238,7 @@
           <w:noProof/>
         </w:rPr>
         <w:drawing>
-          <wp:inline distT="0" distB="0" distL="0" distR="0" wp14:anchorId="4A573233" wp14:editId="0E2DBB8D">
+          <wp:inline distT="0" distB="0" distL="0" distR="0" wp14:anchorId="26F46A6B" wp14:editId="09A35E6B">
             <wp:extent cx="6124575" cy="3448050"/>
             <wp:effectExtent l="0" t="0" r="0" b="0"/>
             <wp:docPr id="11" name="08_order" descr="Order detail — header and category distribution" title="Order detail — header and category distribution"/>
@@ -7305,7 +7305,7 @@
       <w:pPr>
         <w:pStyle w:val="Nadpis2"/>
       </w:pPr>
-      <w:bookmarkStart w:id="19" w:name="_Toc242522647"/>
+      <w:bookmarkStart w:id="19" w:name="_Toc242612443"/>
       <w:r>
         <w:t>4.1  Header and category distribution</w:t>
       </w:r>
@@ -7638,7 +7638,7 @@
       <w:pPr>
         <w:pStyle w:val="Nadpis2"/>
       </w:pPr>
-      <w:bookmarkStart w:id="20" w:name="_Toc242522648"/>
+      <w:bookmarkStart w:id="20" w:name="_Toc242612444"/>
       <w:r>
         <w:t>4.2  Timeline</w:t>
       </w:r>
@@ -7673,7 +7673,7 @@
           <w:noProof/>
         </w:rPr>
         <w:drawing>
-          <wp:inline distT="0" distB="0" distL="0" distR="0" wp14:anchorId="0B80CEB7" wp14:editId="678708B0">
+          <wp:inline distT="0" distB="0" distL="0" distR="0" wp14:anchorId="5B69F6A7" wp14:editId="0B283EF6">
             <wp:extent cx="6124575" cy="1990725"/>
             <wp:effectExtent l="0" t="0" r="0" b="0"/>
             <wp:docPr id="12" name="09_timeline" descr="Order timeline" title="Order timeline"/>
@@ -8250,7 +8250,7 @@
       <w:pPr>
         <w:pStyle w:val="Nadpis2"/>
       </w:pPr>
-      <w:bookmarkStart w:id="21" w:name="_Toc242522649"/>
+      <w:bookmarkStart w:id="21" w:name="_Toc242612445"/>
       <w:r>
         <w:t>4.3  Piece table and filter</w:t>
       </w:r>
@@ -8325,7 +8325,7 @@
           <w:noProof/>
         </w:rPr>
         <w:drawing>
-          <wp:inline distT="0" distB="0" distL="0" distR="0" wp14:anchorId="42652958" wp14:editId="3DEFF3E7">
+          <wp:inline distT="0" distB="0" distL="0" distR="0" wp14:anchorId="22041220" wp14:editId="1138164B">
             <wp:extent cx="6124575" cy="3829050"/>
             <wp:effectExtent l="0" t="0" r="0" b="0"/>
             <wp:docPr id="13" name="10b_tabs" descr="Piece table — Positions group" title="Piece table — Positions group"/>
@@ -8483,8 +8483,8 @@
           <w:noProof/>
         </w:rPr>
         <w:drawing>
-          <wp:inline distT="0" distB="0" distL="0" distR="0" wp14:anchorId="396CC414" wp14:editId="1CAB00F8">
-            <wp:extent cx="6124575" cy="2228850"/>
+          <wp:inline distT="0" distB="0" distL="0" distR="0" wp14:anchorId="2FBBE55B" wp14:editId="565AB10B">
+            <wp:extent cx="6124575" cy="2247900"/>
             <wp:effectExtent l="0" t="0" r="0" b="0"/>
             <wp:docPr id="14" name="11_filter" descr="Filter — NOK pieces only" title="Filter — NOK pieces only"/>
             <wp:cNvGraphicFramePr>
@@ -8509,7 +8509,7 @@
                   <pic:spPr bwMode="auto">
                     <a:xfrm>
                       <a:off x="0" y="0"/>
-                      <a:ext cx="6124575" cy="2228850"/>
+                      <a:ext cx="6124575" cy="2247900"/>
                     </a:xfrm>
                     <a:prstGeom prst="rect">
                       <a:avLst/>
@@ -8550,7 +8550,7 @@
       <w:pPr>
         <w:pStyle w:val="Nadpis2"/>
       </w:pPr>
-      <w:bookmarkStart w:id="22" w:name="_Toc242522650"/>
+      <w:bookmarkStart w:id="22" w:name="_Toc242612446"/>
       <w:r>
         <w:t>4.4  Exporting and printing an order</w:t>
       </w:r>
@@ -8602,7 +8602,7 @@
         <w:pStyle w:val="Nadpis1"/>
         <w:pageBreakBefore/>
       </w:pPr>
-      <w:bookmarkStart w:id="23" w:name="_Toc242522651"/>
+      <w:bookmarkStart w:id="23" w:name="_Toc242612447"/>
       <w:r>
         <w:t>5  Record detail (one piece)</w:t>
       </w:r>
@@ -8627,7 +8627,7 @@
           <w:noProof/>
         </w:rPr>
         <w:drawing>
-          <wp:inline distT="0" distB="0" distL="0" distR="0" wp14:anchorId="6750EB6E" wp14:editId="2664C3CA">
+          <wp:inline distT="0" distB="0" distL="0" distR="0" wp14:anchorId="7046DCCB" wp14:editId="699143DE">
             <wp:extent cx="6124575" cy="3448050"/>
             <wp:effectExtent l="0" t="0" r="0" b="0"/>
             <wp:docPr id="15" name="13_record" descr="Record detail — diagrams" title="Record detail — diagrams"/>
@@ -8795,7 +8795,7 @@
           <w:noProof/>
         </w:rPr>
         <w:drawing>
-          <wp:inline distT="0" distB="0" distL="0" distR="0" wp14:anchorId="02B7D449" wp14:editId="615794F6">
+          <wp:inline distT="0" distB="0" distL="0" distR="0" wp14:anchorId="04E579B0" wp14:editId="727A06D6">
             <wp:extent cx="3800475" cy="5372100"/>
             <wp:effectExtent l="0" t="0" r="0" b="0"/>
             <wp:docPr id="16" name="12_print_record" descr="Printed record report (page 1)" title="Printed record report (page 1)"/>
@@ -8884,7 +8884,7 @@
         <w:pStyle w:val="Nadpis1"/>
         <w:pageBreakBefore/>
       </w:pPr>
-      <w:bookmarkStart w:id="24" w:name="_Toc242522652"/>
+      <w:bookmarkStart w:id="24" w:name="_Toc242612448"/>
       <w:r>
         <w:t>6  Test detail (Testing)</w:t>
       </w:r>
@@ -8909,7 +8909,7 @@
           <w:noProof/>
         </w:rPr>
         <w:drawing>
-          <wp:inline distT="0" distB="0" distL="0" distR="0" wp14:anchorId="77FA9428" wp14:editId="6312BDDD">
+          <wp:inline distT="0" distB="0" distL="0" distR="0" wp14:anchorId="4E653EE5" wp14:editId="1D2ABA79">
             <wp:extent cx="6124575" cy="3448050"/>
             <wp:effectExtent l="0" t="0" r="0" b="0"/>
             <wp:docPr id="17" name="14_testing" descr="Test detail — Test settings" title="Test detail — Test settings"/>
@@ -9428,7 +9428,7 @@
           <w:noProof/>
         </w:rPr>
         <w:drawing>
-          <wp:inline distT="0" distB="0" distL="0" distR="0" wp14:anchorId="610AA086" wp14:editId="6FBD1B54">
+          <wp:inline distT="0" distB="0" distL="0" distR="0" wp14:anchorId="0B408149" wp14:editId="44AC9261">
             <wp:extent cx="6124575" cy="3448050"/>
             <wp:effectExtent l="0" t="0" r="0" b="0"/>
             <wp:docPr id="18" name="17_test_results" descr="Test results" title="Test results"/>
@@ -9495,7 +9495,7 @@
       <w:pPr>
         <w:pStyle w:val="Nadpis2"/>
       </w:pPr>
-      <w:bookmarkStart w:id="25" w:name="_Toc242522653"/>
+      <w:bookmarkStart w:id="25" w:name="_Toc242612449"/>
       <w:r>
         <w:t>6.1  Signal data</w:t>
       </w:r>
@@ -9975,7 +9975,7 @@
           <w:noProof/>
         </w:rPr>
         <w:drawing>
-          <wp:inline distT="0" distB="0" distL="0" distR="0" wp14:anchorId="44CE5FE0" wp14:editId="3C40DFAE">
+          <wp:inline distT="0" distB="0" distL="0" distR="0" wp14:anchorId="2B786A4E" wp14:editId="45930EB9">
             <wp:extent cx="6124575" cy="3448050"/>
             <wp:effectExtent l="0" t="0" r="0" b="0"/>
             <wp:docPr id="19" name="20a_sig_overview" descr="Signal data — Overview" title="Signal data — Overview"/>
@@ -10049,7 +10049,7 @@
           <w:noProof/>
         </w:rPr>
         <w:drawing>
-          <wp:inline distT="0" distB="0" distL="0" distR="0" wp14:anchorId="1FD1DEBE" wp14:editId="515AF245">
+          <wp:inline distT="0" distB="0" distL="0" distR="0" wp14:anchorId="35A8A7A0" wp14:editId="2233657E">
             <wp:extent cx="6124575" cy="3448050"/>
             <wp:effectExtent l="0" t="0" r="0" b="0"/>
             <wp:docPr id="20" name="20d_sig_switching" descr="Signal data — Switching detail" title="Signal data — Switching detail"/>
@@ -10224,7 +10224,7 @@
       <w:pPr>
         <w:pStyle w:val="Nadpis2"/>
       </w:pPr>
-      <w:bookmarkStart w:id="26" w:name="_Toc242522654"/>
+      <w:bookmarkStart w:id="26" w:name="_Toc242612450"/>
       <w:r>
         <w:t>6.2  Printing a test report</w:t>
       </w:r>
@@ -10263,7 +10263,7 @@
         <w:pStyle w:val="Nadpis1"/>
         <w:pageBreakBefore/>
       </w:pPr>
-      <w:bookmarkStart w:id="27" w:name="_Toc242522655"/>
+      <w:bookmarkStart w:id="27" w:name="_Toc242612451"/>
       <w:r>
         <w:t>7  Settings</w:t>
       </w:r>
@@ -10273,7 +10273,7 @@
       <w:pPr>
         <w:pStyle w:val="Nadpis2"/>
       </w:pPr>
-      <w:bookmarkStart w:id="28" w:name="_Toc242522656"/>
+      <w:bookmarkStart w:id="28" w:name="_Toc242612452"/>
       <w:r>
         <w:t>7.1  Preferences</w:t>
       </w:r>
@@ -10298,7 +10298,7 @@
           <w:noProof/>
         </w:rPr>
         <w:drawing>
-          <wp:inline distT="0" distB="0" distL="0" distR="0" wp14:anchorId="290D1357" wp14:editId="75ABB503">
+          <wp:inline distT="0" distB="0" distL="0" distR="0" wp14:anchorId="28C94760" wp14:editId="4CC3F4FB">
             <wp:extent cx="6124575" cy="3448050"/>
             <wp:effectExtent l="0" t="0" r="0" b="0"/>
             <wp:docPr id="21" name="21_settings_prefs" descr="Settings — Preferences" title="Settings — Preferences"/>
@@ -10365,7 +10365,7 @@
       <w:pPr>
         <w:pStyle w:val="Nadpis2"/>
       </w:pPr>
-      <w:bookmarkStart w:id="29" w:name="_Toc242522657"/>
+      <w:bookmarkStart w:id="29" w:name="_Toc242612453"/>
       <w:r>
         <w:t>7.2  Connection</w:t>
       </w:r>
@@ -10390,7 +10390,7 @@
           <w:noProof/>
         </w:rPr>
         <w:drawing>
-          <wp:inline distT="0" distB="0" distL="0" distR="0" wp14:anchorId="574C2E12" wp14:editId="20905DA7">
+          <wp:inline distT="0" distB="0" distL="0" distR="0" wp14:anchorId="149A297D" wp14:editId="79364DE3">
             <wp:extent cx="6124575" cy="3448050"/>
             <wp:effectExtent l="0" t="0" r="0" b="0"/>
             <wp:docPr id="22" name="22_settings_conn" descr="Settings — Connection" title="Settings — Connection"/>
@@ -10457,7 +10457,7 @@
       <w:pPr>
         <w:pStyle w:val="Nadpis2"/>
       </w:pPr>
-      <w:bookmarkStart w:id="30" w:name="_Toc242522658"/>
+      <w:bookmarkStart w:id="30" w:name="_Toc242612454"/>
       <w:r>
         <w:t>7.3  Users</w:t>
       </w:r>
@@ -10482,7 +10482,7 @@
           <w:noProof/>
         </w:rPr>
         <w:drawing>
-          <wp:inline distT="0" distB="0" distL="0" distR="0" wp14:anchorId="5D65A5D6" wp14:editId="1F97D83D">
+          <wp:inline distT="0" distB="0" distL="0" distR="0" wp14:anchorId="3357077C" wp14:editId="2CC6EA01">
             <wp:extent cx="6124575" cy="3448050"/>
             <wp:effectExtent l="0" t="0" r="0" b="0"/>
             <wp:docPr id="23" name="23_settings_users" descr="Settings — Users" title="Settings — Users"/>
@@ -10550,7 +10550,7 @@
         <w:pStyle w:val="Nadpis1"/>
         <w:pageBreakBefore/>
       </w:pPr>
-      <w:bookmarkStart w:id="31" w:name="_Toc242522659"/>
+      <w:bookmarkStart w:id="31" w:name="_Toc242612455"/>
       <w:r>
         <w:t>8  Info</w:t>
       </w:r>
@@ -10575,7 +10575,7 @@
           <w:noProof/>
         </w:rPr>
         <w:drawing>
-          <wp:inline distT="0" distB="0" distL="0" distR="0" wp14:anchorId="1F4F594E" wp14:editId="4221C134">
+          <wp:inline distT="0" distB="0" distL="0" distR="0" wp14:anchorId="660BE68D" wp14:editId="7198A648">
             <wp:extent cx="6124575" cy="3448050"/>
             <wp:effectExtent l="0" t="0" r="0" b="0"/>
             <wp:docPr id="24" name="24_info" descr="Info page" title="Info page"/>
@@ -10643,7 +10643,7 @@
         <w:pStyle w:val="Nadpis1"/>
         <w:pageBreakBefore/>
       </w:pPr>
-      <w:bookmarkStart w:id="32" w:name="_Toc242522660"/>
+      <w:bookmarkStart w:id="32" w:name="_Toc242612456"/>
       <w:r>
         <w:t>9  Common situations</w:t>
       </w:r>
@@ -11359,7 +11359,7 @@
         <w:pStyle w:val="Nadpis1"/>
         <w:pageBreakBefore/>
       </w:pPr>
-      <w:bookmarkStart w:id="33" w:name="_Toc242522661"/>
+      <w:bookmarkStart w:id="33" w:name="_Toc242612457"/>
       <w:r>
         <w:t>Appendix A  Parameter overview</w:t>
       </w:r>
@@ -11370,7 +11370,10 @@
         <w:spacing w:after="120" w:line="288" w:lineRule="auto"/>
       </w:pPr>
       <w:r>
-        <w:t>Parameter abbreviations and names are shown in English in the application (technical names as used by the customer). Values: forces in N (2 decimal places), positions and travels in µm, times in µs, contact resistances in mΩ; an open contact (≥ 1 MΩ) is shown as ∞.</w:t>
+        <w:t>Parameter abbreviations and names are shown in English in the application (technical names as used by the customer). Values are in customer units: forces in mN, positions and travels in µm (0.1 µm), times in µs, contact resistances in mΩ (0.1 mΩ); a resistance above 999.9 mΩ (open contact) is shown as ∞. Positions FP, OP, RP and TTP give the height of the actuator above the mounting-hole axis — they decrease when actuated. In older files (before 10/2026) the positions are on the encoder scale; the applicati</w:t>
+      </w:r>
+      <w:r>
+        <w:t>on shows a note.</w:t>
       </w:r>
     </w:p>
     <w:p>
@@ -11394,7 +11397,7 @@
           <w:sz w:val="18"/>
           <w:szCs w:val="18"/>
         </w:rPr>
-        <w:t>Forces [N]</w:t>
+        <w:t>Forces [mN]</w:t>
       </w:r>
     </w:p>
     <w:tbl>
@@ -11612,7 +11615,7 @@
                 <w:sz w:val="18"/>
                 <w:szCs w:val="18"/>
               </w:rPr>
-              <w:t>Force [N] at the operating point (OP). If it is too high or too low, the switch does not meet the specification.</w:t>
+              <w:t>Force [mN] at the operating point (OP). If it is too high or too low, the switch does not meet the specification.</w:t>
             </w:r>
           </w:p>
         </w:tc>
@@ -11707,7 +11710,7 @@
                 <w:sz w:val="18"/>
                 <w:szCs w:val="18"/>
               </w:rPr>
-              <w:t>Force [N] at which the contact releases on the return stroke (RP). Together with OF it defines the force hysteresis.</w:t>
+              <w:t>Force [mN] at which the contact releases on the return stroke (RP). Together with OF it defines the force hysteresis.</w:t>
             </w:r>
           </w:p>
         </w:tc>
@@ -11802,7 +11805,7 @@
                 <w:sz w:val="18"/>
                 <w:szCs w:val="18"/>
               </w:rPr>
-              <w:t>Maximum force [N] at the end of travel (TTP). Must not exceed the permitted limit for the switch type.</w:t>
+              <w:t>Maximum force [mN] at the end of travel (TTP). Must not exceed the permitted limit for the switch type.</w:t>
             </w:r>
           </w:p>
         </w:tc>
@@ -12052,7 +12055,7 @@
                 <w:sz w:val="18"/>
                 <w:szCs w:val="18"/>
               </w:rPr>
-              <w:t>Rest position of the actuator [µm] without external force — the reference point for all travel values.</w:t>
+              <w:t>Rest position of the actuator [µm] without external force — height above the mounting-hole axis (as in the drawing; decreases when actuated). Older files: carriage travel from its rest position.</w:t>
             </w:r>
           </w:p>
         </w:tc>
@@ -12147,7 +12150,7 @@
                 <w:sz w:val="18"/>
                 <w:szCs w:val="18"/>
               </w:rPr>
-              <w:t>Position [µm] where the contact switches on the forward stroke (absolute position). PT = OP − FP.</w:t>
+              <w:t>Position [µm] where the contact switches on the forward stroke — height above the mounting-hole axis. PT = FP − OP.</w:t>
             </w:r>
           </w:p>
         </w:tc>
@@ -12242,7 +12245,7 @@
                 <w:sz w:val="18"/>
                 <w:szCs w:val="18"/>
               </w:rPr>
-              <w:t>Position [µm] where the contact releases on the return stroke (absolute position). MD = OP − RP.</w:t>
+              <w:t>Position [µm] where the contact releases on the return stroke — height above the mounting-hole axis. MD = RP − OP.</w:t>
             </w:r>
           </w:p>
         </w:tc>
@@ -12337,7 +12340,7 @@
                 <w:sz w:val="18"/>
                 <w:szCs w:val="18"/>
               </w:rPr>
-              <w:t>Position [µm] at the end of travel — the deepest point of actuation during the measurement. TT = TTP − FP.</w:t>
+              <w:t>Position [µm] at the end of travel — the deepest point of actuation (height above the mounting-hole axis). TT = FP − TTP.</w:t>
             </w:r>
           </w:p>
         </w:tc>
@@ -12557,7 +12560,7 @@
                 <w:sz w:val="18"/>
                 <w:szCs w:val="18"/>
               </w:rPr>
-              <w:t>Pre-travel [µm] (OP − FP)</w:t>
+              <w:t>Pre-travel [µm] (FP → OP)</w:t>
             </w:r>
           </w:p>
         </w:tc>
@@ -12587,7 +12590,7 @@
                 <w:sz w:val="18"/>
                 <w:szCs w:val="18"/>
               </w:rPr>
-              <w:t>Pre-travel [µm] — distance from FP to OP (PT = OP − FP). Must be sufficient for reliable switching.</w:t>
+              <w:t>Pre-travel [µm] — distance from FP to OP (PT = FP − OP). Must be sufficient for reliable switching.</w:t>
             </w:r>
           </w:p>
         </w:tc>
@@ -12652,7 +12655,7 @@
                 <w:sz w:val="18"/>
                 <w:szCs w:val="18"/>
               </w:rPr>
-              <w:t>Overtravel [µm] (TTP − OP)</w:t>
+              <w:t>Overtravel [µm] (OP → TTP)</w:t>
             </w:r>
           </w:p>
         </w:tc>
@@ -12682,7 +12685,7 @@
                 <w:sz w:val="18"/>
                 <w:szCs w:val="18"/>
               </w:rPr>
-              <w:t>Overtravel [µm] — reserve beyond the operating point (OT = TTP − OP). Protects the contact from overload.</w:t>
+              <w:t>Overtravel [µm] — reserve beyond the operating point (OT = OP − TTP). Protects the contact from overload.</w:t>
             </w:r>
           </w:p>
         </w:tc>
@@ -12747,7 +12750,7 @@
                 <w:sz w:val="18"/>
                 <w:szCs w:val="18"/>
               </w:rPr>
-              <w:t>Releasing Travel [µm] (TTP − RP)</w:t>
+              <w:t>Releasing Travel [µm] (TTP → RP)</w:t>
             </w:r>
           </w:p>
         </w:tc>
@@ -12777,7 +12780,7 @@
                 <w:sz w:val="18"/>
                 <w:szCs w:val="18"/>
               </w:rPr>
-              <w:t>Releasing travel [µm] — distance from the end of travel back to the releasing point (RT = TTP − RP).</w:t>
+              <w:t>Releasing travel [µm] — distance from the end of travel back to the releasing point (RT = RP − TTP).</w:t>
             </w:r>
           </w:p>
         </w:tc>
@@ -12842,7 +12845,7 @@
                 <w:sz w:val="18"/>
                 <w:szCs w:val="18"/>
               </w:rPr>
-              <w:t>Movement Differential [µm] (OP − RP)</w:t>
+              <w:t>Movement Differential [µm] (OP → RP)</w:t>
             </w:r>
           </w:p>
         </w:tc>
@@ -12872,7 +12875,7 @@
                 <w:sz w:val="18"/>
                 <w:szCs w:val="18"/>
               </w:rPr>
-              <w:t>Movement differential [µm] — distance between OP and RP (MD = OP − RP, position hysteresis). Larger MD = more stable switching. Negative MD = negative hysteresis (RP lies beyond OP) — abnormal switch behaviour.</w:t>
+              <w:t>Movement differential [µm] — distance between OP and RP (MD = RP − OP, position hysteresis). Larger MD = more stable switching. Negative MD = negative hysteresis (RP lies beyond OP) — abnormal switch behaviour.</w:t>
             </w:r>
           </w:p>
         </w:tc>
@@ -12937,7 +12940,7 @@
                 <w:sz w:val="18"/>
                 <w:szCs w:val="18"/>
               </w:rPr>
-              <w:t>Total Travel [µm] (TTP − FP)</w:t>
+              <w:t>Total Travel [µm] (FP → TTP)</w:t>
             </w:r>
           </w:p>
         </w:tc>
@@ -12967,7 +12970,7 @@
                 <w:sz w:val="18"/>
                 <w:szCs w:val="18"/>
               </w:rPr>
-              <w:t>Total travel [µm] — distance from FP to TTP (TT = TTP − FP).</w:t>
+              <w:t>Total travel [µm] — distance from FP to TTP (TT = FP − TTP).</w:t>
             </w:r>
           </w:p>
         </w:tc>
@@ -13752,7 +13755,7 @@
                 <w:sz w:val="18"/>
                 <w:szCs w:val="18"/>
               </w:rPr>
-              <w:t>Resistance [mΩ] of the normally closed (NC) contact at the operating point (OP), negative pole. High resistance = degradation.</w:t>
+              <w:t>Resistance [mΩ] of the normally closed (NC) contact at the operating point (OP), negative pole. High resistance = degradation. Above 999.9 mΩ = open (∞).</w:t>
             </w:r>
           </w:p>
         </w:tc>
@@ -14613,7 +14616,7 @@
         <w:sz w:val="16"/>
         <w:szCs w:val="16"/>
       </w:rPr>
-      <w:t>ScadaViewer 2.1.0</w:t>
+      <w:t>ScadaViewer 2.1.2</w:t>
     </w:r>
     <w:r>
       <w:rPr>
@@ -14631,213 +14634,213 @@
 <file path=word/numbering.xml><?xml version="1.0" encoding="utf-8"?>
 <w:numbering xmlns:wpc="http://schemas.microsoft.com/office/word/2010/wordprocessingCanvas" xmlns:cx="http://schemas.microsoft.com/office/drawing/2014/chartex" xmlns:cx1="http://schemas.microsoft.com/office/drawing/2015/9/8/chartex" xmlns:cx2="http://schemas.microsoft.com/office/drawing/2015/10/21/chartex" xmlns:cx3="http://schemas.microsoft.com/office/drawing/2016/5/9/chartex" xmlns:cx4="http://schemas.microsoft.com/office/drawing/2016/5/10/chartex" xmlns:cx5="http://schemas.microsoft.com/office/drawing/2016/5/11/chartex" xmlns:cx6="http://schemas.microsoft.com/office/drawing/2016/5/12/chartex" xmlns:cx7="http://schemas.microsoft.com/office/drawing/2016/5/13/chartex" xmlns:cx8="http://schemas.microsoft.com/office/drawing/2016/5/14/chartex" xmlns:mc="http://schemas.openxmlformats.org/markup-compatibility/2006" xmlns:aink="http://schemas.microsoft.com/office/drawing/2016/ink" xmlns:am3d="http://schemas.microsoft.com/office/drawing/2017/model3d" xmlns:o="urn:schemas-microsoft-com:office:office" xmlns:oel="http://schemas.microsoft.com/office/2019/extlst" xmlns:r="http://schemas.openxmlformats.org/officeDocument/2006/relationships" xmlns:m="http://schemas.openxmlformats.org/officeDocument/2006/math" xmlns:v="urn:schemas-microsoft-com:vml" xmlns:wp14="http://schemas.microsoft.com/office/word/2010/wordprocessingDrawing" xmlns:wp="http://schemas.openxmlformats.org/drawingml/2006/wordprocessingDrawing" xmlns:w10="urn:schemas-microsoft-com:office:word" xmlns:w="http://schemas.openxmlformats.org/wordprocessingml/2006/main" xmlns:w14="http://schemas.microsoft.com/office/word/2010/wordml" xmlns:w15="http://schemas.microsoft.com/office/word/2012/wordml" xmlns:w16cex="http://schemas.microsoft.com/office/word/2018/wordml/cex" xmlns:w16cid="http://schemas.microsoft.com/office/word/2016/wordml/cid" xmlns:w16="http://schemas.microsoft.com/office/word/2018/wordml" xmlns:w16du="http://schemas.microsoft.com/office/word/2023/wordml/word16du" xmlns:w16sdtdh="http://schemas.microsoft.com/office/word/2020/wordml/sdtdatahash" xmlns:w16sdtfl="http://schemas.microsoft.com/office/word/2024/wordml/sdtformatlock" xmlns:w16se="http://schemas.microsoft.com/office/word/2015/wordml/symex" xmlns:wpg="http://schemas.microsoft.com/office/word/2010/wordprocessingGroup" xmlns:wpi="http://schemas.microsoft.com/office/word/2010/wordprocessingInk" xmlns:wne="http://schemas.microsoft.com/office/word/2006/wordml" xmlns:wps="http://schemas.microsoft.com/office/word/2010/wordprocessingShape" mc:Ignorable="w14 w15 w16se w16cid w16 w16cex w16sdtdh w16sdtfl w16du wp14">
   <w:abstractNum w:abstractNumId="0" w15:restartNumberingAfterBreak="0">
-    <w:nsid w:val="25A15396"/>
+    <w:nsid w:val="268325AA"/>
     <w:multiLevelType w:val="hybridMultilevel"/>
-    <w:tmpl w:val="5D0C2B52"/>
-    <w:lvl w:ilvl="0" w:tplc="5B36ACC2" w:tentative="1">
+    <w:tmpl w:val="3D02C414"/>
+    <w:lvl w:ilvl="0" w:tplc="C56AFA5C">
       <w:start w:val="1"/>
       <w:numFmt w:val="bullet"/>
-      <w:lvlText w:val="●"/>
+      <w:lvlText w:val="•"/>
       <w:lvlJc w:val="left"/>
       <w:pPr>
-        <w:ind w:left="720" w:hanging="360"/>
+        <w:ind w:left="540" w:hanging="270"/>
       </w:pPr>
     </w:lvl>
-    <w:lvl w:ilvl="1" w:tplc="0038E340" w:tentative="1">
-      <w:start w:val="1"/>
-      <w:numFmt w:val="bullet"/>
-      <w:lvlText w:val="○"/>
-      <w:lvlJc w:val="left"/>
-      <w:pPr>
-        <w:ind w:left="1440" w:hanging="360"/>
-      </w:pPr>
-    </w:lvl>
-    <w:lvl w:ilvl="2" w:tplc="D2686B90" w:tentative="1">
-      <w:start w:val="1"/>
-      <w:numFmt w:val="bullet"/>
-      <w:lvlText w:val="■"/>
-      <w:lvlJc w:val="left"/>
-      <w:pPr>
-        <w:ind w:left="2160" w:hanging="360"/>
-      </w:pPr>
-    </w:lvl>
-    <w:lvl w:ilvl="3" w:tplc="EA24F6A2" w:tentative="1">
-      <w:start w:val="1"/>
-      <w:numFmt w:val="bullet"/>
-      <w:lvlText w:val="●"/>
-      <w:lvlJc w:val="left"/>
-      <w:pPr>
-        <w:ind w:left="2880" w:hanging="360"/>
-      </w:pPr>
-    </w:lvl>
-    <w:lvl w:ilvl="4" w:tplc="42DAF868" w:tentative="1">
-      <w:start w:val="1"/>
-      <w:numFmt w:val="bullet"/>
-      <w:lvlText w:val="○"/>
-      <w:lvlJc w:val="left"/>
-      <w:pPr>
-        <w:ind w:left="3600" w:hanging="360"/>
-      </w:pPr>
-    </w:lvl>
-    <w:lvl w:ilvl="5" w:tplc="3FAC3EAA" w:tentative="1">
-      <w:start w:val="1"/>
-      <w:numFmt w:val="bullet"/>
-      <w:lvlText w:val="■"/>
-      <w:lvlJc w:val="left"/>
-      <w:pPr>
-        <w:ind w:left="4320" w:hanging="360"/>
-      </w:pPr>
-    </w:lvl>
-    <w:lvl w:ilvl="6" w:tplc="8C8C4A50" w:tentative="1">
-      <w:start w:val="1"/>
-      <w:numFmt w:val="bullet"/>
-      <w:lvlText w:val="●"/>
-      <w:lvlJc w:val="left"/>
-      <w:pPr>
-        <w:ind w:left="5040" w:hanging="360"/>
-      </w:pPr>
-    </w:lvl>
-    <w:lvl w:ilvl="7" w:tplc="4BEAA406" w:tentative="1">
-      <w:start w:val="1"/>
-      <w:numFmt w:val="bullet"/>
-      <w:lvlText w:val="●"/>
-      <w:lvlJc w:val="left"/>
-      <w:pPr>
-        <w:ind w:left="5760" w:hanging="360"/>
-      </w:pPr>
-    </w:lvl>
-    <w:lvl w:ilvl="8" w:tplc="000A011C" w:tentative="1">
-      <w:start w:val="1"/>
-      <w:numFmt w:val="bullet"/>
-      <w:lvlText w:val="●"/>
-      <w:lvlJc w:val="left"/>
-      <w:pPr>
-        <w:ind w:left="6480" w:hanging="360"/>
-      </w:pPr>
-    </w:lvl>
-  </w:abstractNum>
-  <w:abstractNum w:abstractNumId="1" w15:restartNumberingAfterBreak="0">
-    <w:nsid w:val="2A9845E2"/>
-    <w:multiLevelType w:val="hybridMultilevel"/>
-    <w:tmpl w:val="4D2265BC"/>
-    <w:lvl w:ilvl="0" w:tplc="59B87044">
-      <w:start w:val="1"/>
-      <w:numFmt w:val="decimal"/>
-      <w:lvlText w:val="%1."/>
-      <w:lvlJc w:val="left"/>
-      <w:pPr>
-        <w:ind w:left="540" w:hanging="300"/>
-      </w:pPr>
-    </w:lvl>
-    <w:lvl w:ilvl="1" w:tplc="4CACB28A">
+    <w:lvl w:ilvl="1" w:tplc="575A7172">
       <w:numFmt w:val="decimal"/>
       <w:lvlText w:val=""/>
       <w:lvlJc w:val="left"/>
     </w:lvl>
-    <w:lvl w:ilvl="2" w:tplc="0E10D6CC">
+    <w:lvl w:ilvl="2" w:tplc="9C7E0664">
       <w:numFmt w:val="decimal"/>
       <w:lvlText w:val=""/>
       <w:lvlJc w:val="left"/>
     </w:lvl>
-    <w:lvl w:ilvl="3" w:tplc="E02C9AA6">
+    <w:lvl w:ilvl="3" w:tplc="7BC24DCC">
       <w:numFmt w:val="decimal"/>
       <w:lvlText w:val=""/>
       <w:lvlJc w:val="left"/>
     </w:lvl>
-    <w:lvl w:ilvl="4" w:tplc="6532B940">
+    <w:lvl w:ilvl="4" w:tplc="0F34B644">
       <w:numFmt w:val="decimal"/>
       <w:lvlText w:val=""/>
       <w:lvlJc w:val="left"/>
     </w:lvl>
-    <w:lvl w:ilvl="5" w:tplc="7B584086">
+    <w:lvl w:ilvl="5" w:tplc="BF280F12">
       <w:numFmt w:val="decimal"/>
       <w:lvlText w:val=""/>
       <w:lvlJc w:val="left"/>
     </w:lvl>
-    <w:lvl w:ilvl="6" w:tplc="A9268BB6">
+    <w:lvl w:ilvl="6" w:tplc="7F767490">
       <w:numFmt w:val="decimal"/>
       <w:lvlText w:val=""/>
       <w:lvlJc w:val="left"/>
     </w:lvl>
-    <w:lvl w:ilvl="7" w:tplc="5B96FC78">
+    <w:lvl w:ilvl="7" w:tplc="4CE2D8B0">
       <w:numFmt w:val="decimal"/>
       <w:lvlText w:val=""/>
       <w:lvlJc w:val="left"/>
     </w:lvl>
-    <w:lvl w:ilvl="8" w:tplc="4AF050E2">
+    <w:lvl w:ilvl="8" w:tplc="7E8E97FE">
       <w:numFmt w:val="decimal"/>
       <w:lvlText w:val=""/>
       <w:lvlJc w:val="left"/>
     </w:lvl>
   </w:abstractNum>
-  <w:abstractNum w:abstractNumId="2" w15:restartNumberingAfterBreak="0">
-    <w:nsid w:val="50952546"/>
+  <w:abstractNum w:abstractNumId="1" w15:restartNumberingAfterBreak="0">
+    <w:nsid w:val="4E902C9D"/>
     <w:multiLevelType w:val="hybridMultilevel"/>
-    <w:tmpl w:val="50F65828"/>
-    <w:lvl w:ilvl="0" w:tplc="4D8687B6">
+    <w:tmpl w:val="CE1810BC"/>
+    <w:lvl w:ilvl="0" w:tplc="41886278" w:tentative="1">
       <w:start w:val="1"/>
       <w:numFmt w:val="bullet"/>
-      <w:lvlText w:val="•"/>
+      <w:lvlText w:val="●"/>
       <w:lvlJc w:val="left"/>
       <w:pPr>
-        <w:ind w:left="540" w:hanging="270"/>
+        <w:ind w:left="720" w:hanging="360"/>
       </w:pPr>
     </w:lvl>
-    <w:lvl w:ilvl="1" w:tplc="CBD426AE">
+    <w:lvl w:ilvl="1" w:tplc="EE4A13DA" w:tentative="1">
+      <w:start w:val="1"/>
+      <w:numFmt w:val="bullet"/>
+      <w:lvlText w:val="○"/>
+      <w:lvlJc w:val="left"/>
+      <w:pPr>
+        <w:ind w:left="1440" w:hanging="360"/>
+      </w:pPr>
+    </w:lvl>
+    <w:lvl w:ilvl="2" w:tplc="120EE6B6" w:tentative="1">
+      <w:start w:val="1"/>
+      <w:numFmt w:val="bullet"/>
+      <w:lvlText w:val="■"/>
+      <w:lvlJc w:val="left"/>
+      <w:pPr>
+        <w:ind w:left="2160" w:hanging="360"/>
+      </w:pPr>
+    </w:lvl>
+    <w:lvl w:ilvl="3" w:tplc="8B9EB91C" w:tentative="1">
+      <w:start w:val="1"/>
+      <w:numFmt w:val="bullet"/>
+      <w:lvlText w:val="●"/>
+      <w:lvlJc w:val="left"/>
+      <w:pPr>
+        <w:ind w:left="2880" w:hanging="360"/>
+      </w:pPr>
+    </w:lvl>
+    <w:lvl w:ilvl="4" w:tplc="FD7E8C0C" w:tentative="1">
+      <w:start w:val="1"/>
+      <w:numFmt w:val="bullet"/>
+      <w:lvlText w:val="○"/>
+      <w:lvlJc w:val="left"/>
+      <w:pPr>
+        <w:ind w:left="3600" w:hanging="360"/>
+      </w:pPr>
+    </w:lvl>
+    <w:lvl w:ilvl="5" w:tplc="51709D5A" w:tentative="1">
+      <w:start w:val="1"/>
+      <w:numFmt w:val="bullet"/>
+      <w:lvlText w:val="■"/>
+      <w:lvlJc w:val="left"/>
+      <w:pPr>
+        <w:ind w:left="4320" w:hanging="360"/>
+      </w:pPr>
+    </w:lvl>
+    <w:lvl w:ilvl="6" w:tplc="0A6AF486" w:tentative="1">
+      <w:start w:val="1"/>
+      <w:numFmt w:val="bullet"/>
+      <w:lvlText w:val="●"/>
+      <w:lvlJc w:val="left"/>
+      <w:pPr>
+        <w:ind w:left="5040" w:hanging="360"/>
+      </w:pPr>
+    </w:lvl>
+    <w:lvl w:ilvl="7" w:tplc="57D03BB6" w:tentative="1">
+      <w:start w:val="1"/>
+      <w:numFmt w:val="bullet"/>
+      <w:lvlText w:val="●"/>
+      <w:lvlJc w:val="left"/>
+      <w:pPr>
+        <w:ind w:left="5760" w:hanging="360"/>
+      </w:pPr>
+    </w:lvl>
+    <w:lvl w:ilvl="8" w:tplc="0AF80B20" w:tentative="1">
+      <w:start w:val="1"/>
+      <w:numFmt w:val="bullet"/>
+      <w:lvlText w:val="●"/>
+      <w:lvlJc w:val="left"/>
+      <w:pPr>
+        <w:ind w:left="6480" w:hanging="360"/>
+      </w:pPr>
+    </w:lvl>
+  </w:abstractNum>
+  <w:abstractNum w:abstractNumId="2" w15:restartNumberingAfterBreak="0">
+    <w:nsid w:val="7D2C47BA"/>
+    <w:multiLevelType w:val="hybridMultilevel"/>
+    <w:tmpl w:val="B818214C"/>
+    <w:lvl w:ilvl="0" w:tplc="C9FEB734">
+      <w:start w:val="1"/>
+      <w:numFmt w:val="decimal"/>
+      <w:lvlText w:val="%1."/>
+      <w:lvlJc w:val="left"/>
+      <w:pPr>
+        <w:ind w:left="540" w:hanging="300"/>
+      </w:pPr>
+    </w:lvl>
+    <w:lvl w:ilvl="1" w:tplc="DC2E7130">
       <w:numFmt w:val="decimal"/>
       <w:lvlText w:val=""/>
       <w:lvlJc w:val="left"/>
     </w:lvl>
-    <w:lvl w:ilvl="2" w:tplc="3C1ECC18">
+    <w:lvl w:ilvl="2" w:tplc="C270F23E">
       <w:numFmt w:val="decimal"/>
       <w:lvlText w:val=""/>
       <w:lvlJc w:val="left"/>
     </w:lvl>
-    <w:lvl w:ilvl="3" w:tplc="5EA0ABD2">
+    <w:lvl w:ilvl="3" w:tplc="B5E81910">
       <w:numFmt w:val="decimal"/>
       <w:lvlText w:val=""/>
       <w:lvlJc w:val="left"/>
     </w:lvl>
-    <w:lvl w:ilvl="4" w:tplc="079AF58A">
+    <w:lvl w:ilvl="4" w:tplc="DC3EDE06">
       <w:numFmt w:val="decimal"/>
       <w:lvlText w:val=""/>
       <w:lvlJc w:val="left"/>
     </w:lvl>
-    <w:lvl w:ilvl="5" w:tplc="6AC6B60E">
+    <w:lvl w:ilvl="5" w:tplc="3A7AE3D2">
       <w:numFmt w:val="decimal"/>
       <w:lvlText w:val=""/>
       <w:lvlJc w:val="left"/>
     </w:lvl>
-    <w:lvl w:ilvl="6" w:tplc="D3366EEA">
+    <w:lvl w:ilvl="6" w:tplc="AF6685DC">
       <w:numFmt w:val="decimal"/>
       <w:lvlText w:val=""/>
       <w:lvlJc w:val="left"/>
     </w:lvl>
-    <w:lvl w:ilvl="7" w:tplc="9A66E208">
+    <w:lvl w:ilvl="7" w:tplc="C63C9686">
       <w:numFmt w:val="decimal"/>
       <w:lvlText w:val=""/>
       <w:lvlJc w:val="left"/>
     </w:lvl>
-    <w:lvl w:ilvl="8" w:tplc="100E331A">
+    <w:lvl w:ilvl="8" w:tplc="FBF2F9DA">
       <w:numFmt w:val="decimal"/>
       <w:lvlText w:val=""/>
       <w:lvlJc w:val="left"/>
     </w:lvl>
   </w:abstractNum>
-  <w:num w:numId="1" w16cid:durableId="958727668">
+  <w:num w:numId="1" w16cid:durableId="1385956361">
+    <w:abstractNumId w:val="1"/>
+    <w:lvlOverride w:ilvl="0">
+      <w:startOverride w:val="1"/>
+    </w:lvlOverride>
+  </w:num>
+  <w:num w:numId="2" w16cid:durableId="1322737163">
     <w:abstractNumId w:val="0"/>
     <w:lvlOverride w:ilvl="0">
       <w:startOverride w:val="1"/>
     </w:lvlOverride>
   </w:num>
-  <w:num w:numId="2" w16cid:durableId="1072001714">
+  <w:num w:numId="3" w16cid:durableId="730882622">
     <w:abstractNumId w:val="2"/>
-    <w:lvlOverride w:ilvl="0">
-      <w:startOverride w:val="1"/>
-    </w:lvlOverride>
-  </w:num>
-  <w:num w:numId="3" w16cid:durableId="572348472">
-    <w:abstractNumId w:val="1"/>
     <w:lvlOverride w:ilvl="0">
       <w:startOverride w:val="1"/>
     </w:lvlOverride>
@@ -15472,7 +15475,7 @@
     <w:autoRedefine/>
     <w:uiPriority w:val="39"/>
     <w:unhideWhenUsed/>
-    <w:rsid w:val="00A4535D"/>
+    <w:rsid w:val="00E37EA4"/>
     <w:pPr>
       <w:spacing w:after="100"/>
     </w:pPr>
@@ -15484,7 +15487,7 @@
     <w:autoRedefine/>
     <w:uiPriority w:val="39"/>
     <w:unhideWhenUsed/>
-    <w:rsid w:val="00A4535D"/>
+    <w:rsid w:val="00E37EA4"/>
     <w:pPr>
       <w:spacing w:after="100"/>
       <w:ind w:left="200"/>

</xml_diff>

<commit_message>
fix: ověření kontraktu jednotek napříč aplikacemi — nálezy V1–V10
Nezávislé ověření (4 větve, 769 reálných signálů × 3 hodnoty C, 0 neshod hodnot):
- 0 u polohy, síly a odporu = nestanoveno (Analyzing W5/W6) → „—"; bod RP se nehledá
  podle nulové polohy (dřív se vykreslil na TTP)
- nápověda odporů Neg/Pos = před/po přepnutí (dřív „pól"), CS + EN, manuál přegenerován
- XLSX Testing s originálními hlavičkami v jednotkách zákazníka, prázdné hodnoty zůstávají,
  rozepnutý kontakt jednotně 9999.9, polohy enkodéru „[um, encoder]"
- ZoomPanel: obrácená osa (hystereze) — zoom a posun správným směrem
- MD v hysterezi se znaménkem; nan/inf; ∞ zaokrouhleně; SamplesReserve 0,1; upozornění
  „enkodér" i v Database
- dokumentace (pravidla, how_to_extend, architecture, roadmap, acceptance_test, project_reviews)

Testy: backend 347, frontend 123, tsc 0, lint 0.

Co-Authored-By: Claude Opus 5.5 <noreply@anthropic.com>
</commit_message>
<xml_diff>
--- a/04_docs/manual/ScadaViewer_User_Manual_EN.docx
+++ b/04_docs/manual/ScadaViewer_User_Manual_EN.docx
@@ -341,7 +341,7 @@
     <w:sdt>
       <w:sdtPr>
         <w:alias w:val="Contents"/>
-        <w:id w:val="1192572391"/>
+        <w:id w:val="1208603671"/>
       </w:sdtPr>
       <w:sdtEndPr/>
       <w:sdtContent>
@@ -370,7 +370,7 @@
           <w:r>
             <w:fldChar w:fldCharType="separate"/>
           </w:r>
-          <w:hyperlink w:anchor="_Toc242612424" w:history="1">
+          <w:hyperlink w:anchor="_Toc242625798" w:history="1">
             <w:r>
               <w:rPr>
                 <w:rStyle w:val="Hypertextovodkaz"/>
@@ -394,7 +394,7 @@
               <w:rPr>
                 <w:noProof/>
               </w:rPr>
-              <w:instrText xml:space="preserve"> PAGEREF _Toc242612424 \h </w:instrText>
+              <w:instrText xml:space="preserve"> PAGEREF _Toc242625798 \h </w:instrText>
             </w:r>
             <w:r>
               <w:rPr>
@@ -437,7 +437,7 @@
               <w14:ligatures w14:val="standardContextual"/>
             </w:rPr>
           </w:pPr>
-          <w:hyperlink w:anchor="_Toc242612425" w:history="1">
+          <w:hyperlink w:anchor="_Toc242625799" w:history="1">
             <w:r>
               <w:rPr>
                 <w:rStyle w:val="Hypertextovodkaz"/>
@@ -461,7 +461,7 @@
               <w:rPr>
                 <w:noProof/>
               </w:rPr>
-              <w:instrText xml:space="preserve"> PAGEREF _Toc242612425 \h </w:instrText>
+              <w:instrText xml:space="preserve"> PAGEREF _Toc242625799 \h </w:instrText>
             </w:r>
             <w:r>
               <w:rPr>
@@ -504,7 +504,7 @@
               <w14:ligatures w14:val="standardContextual"/>
             </w:rPr>
           </w:pPr>
-          <w:hyperlink w:anchor="_Toc242612426" w:history="1">
+          <w:hyperlink w:anchor="_Toc242625800" w:history="1">
             <w:r>
               <w:rPr>
                 <w:rStyle w:val="Hypertextovodkaz"/>
@@ -528,7 +528,7 @@
               <w:rPr>
                 <w:noProof/>
               </w:rPr>
-              <w:instrText xml:space="preserve"> PAGEREF _Toc242612426 \h </w:instrText>
+              <w:instrText xml:space="preserve"> PAGEREF _Toc242625800 \h </w:instrText>
             </w:r>
             <w:r>
               <w:rPr>
@@ -571,7 +571,7 @@
               <w14:ligatures w14:val="standardContextual"/>
             </w:rPr>
           </w:pPr>
-          <w:hyperlink w:anchor="_Toc242612427" w:history="1">
+          <w:hyperlink w:anchor="_Toc242625801" w:history="1">
             <w:r>
               <w:rPr>
                 <w:rStyle w:val="Hypertextovodkaz"/>
@@ -595,7 +595,7 @@
               <w:rPr>
                 <w:noProof/>
               </w:rPr>
-              <w:instrText xml:space="preserve"> PAGEREF _Toc242612427 \h </w:instrText>
+              <w:instrText xml:space="preserve"> PAGEREF _Toc242625801 \h </w:instrText>
             </w:r>
             <w:r>
               <w:rPr>
@@ -638,7 +638,7 @@
               <w14:ligatures w14:val="standardContextual"/>
             </w:rPr>
           </w:pPr>
-          <w:hyperlink w:anchor="_Toc242612428" w:history="1">
+          <w:hyperlink w:anchor="_Toc242625802" w:history="1">
             <w:r>
               <w:rPr>
                 <w:rStyle w:val="Hypertextovodkaz"/>
@@ -662,7 +662,7 @@
               <w:rPr>
                 <w:noProof/>
               </w:rPr>
-              <w:instrText xml:space="preserve"> PAGEREF _Toc242612428 \h </w:instrText>
+              <w:instrText xml:space="preserve"> PAGEREF _Toc242625802 \h </w:instrText>
             </w:r>
             <w:r>
               <w:rPr>
@@ -705,7 +705,7 @@
               <w14:ligatures w14:val="standardContextual"/>
             </w:rPr>
           </w:pPr>
-          <w:hyperlink w:anchor="_Toc242612429" w:history="1">
+          <w:hyperlink w:anchor="_Toc242625803" w:history="1">
             <w:r>
               <w:rPr>
                 <w:rStyle w:val="Hypertextovodkaz"/>
@@ -729,7 +729,7 @@
               <w:rPr>
                 <w:noProof/>
               </w:rPr>
-              <w:instrText xml:space="preserve"> PAGEREF _Toc242612429 \h </w:instrText>
+              <w:instrText xml:space="preserve"> PAGEREF _Toc242625803 \h </w:instrText>
             </w:r>
             <w:r>
               <w:rPr>
@@ -772,7 +772,7 @@
               <w14:ligatures w14:val="standardContextual"/>
             </w:rPr>
           </w:pPr>
-          <w:hyperlink w:anchor="_Toc242612430" w:history="1">
+          <w:hyperlink w:anchor="_Toc242625804" w:history="1">
             <w:r>
               <w:rPr>
                 <w:rStyle w:val="Hypertextovodkaz"/>
@@ -796,7 +796,7 @@
               <w:rPr>
                 <w:noProof/>
               </w:rPr>
-              <w:instrText xml:space="preserve"> PAGEREF _Toc242612430 \h </w:instrText>
+              <w:instrText xml:space="preserve"> PAGEREF _Toc242625804 \h </w:instrText>
             </w:r>
             <w:r>
               <w:rPr>
@@ -839,7 +839,7 @@
               <w14:ligatures w14:val="standardContextual"/>
             </w:rPr>
           </w:pPr>
-          <w:hyperlink w:anchor="_Toc242612431" w:history="1">
+          <w:hyperlink w:anchor="_Toc242625805" w:history="1">
             <w:r>
               <w:rPr>
                 <w:rStyle w:val="Hypertextovodkaz"/>
@@ -863,7 +863,7 @@
               <w:rPr>
                 <w:noProof/>
               </w:rPr>
-              <w:instrText xml:space="preserve"> PAGEREF _Toc242612431 \h </w:instrText>
+              <w:instrText xml:space="preserve"> PAGEREF _Toc242625805 \h </w:instrText>
             </w:r>
             <w:r>
               <w:rPr>
@@ -906,7 +906,7 @@
               <w14:ligatures w14:val="standardContextual"/>
             </w:rPr>
           </w:pPr>
-          <w:hyperlink w:anchor="_Toc242612432" w:history="1">
+          <w:hyperlink w:anchor="_Toc242625806" w:history="1">
             <w:r>
               <w:rPr>
                 <w:rStyle w:val="Hypertextovodkaz"/>
@@ -930,7 +930,7 @@
               <w:rPr>
                 <w:noProof/>
               </w:rPr>
-              <w:instrText xml:space="preserve"> PAGEREF _Toc242612432 \h </w:instrText>
+              <w:instrText xml:space="preserve"> PAGEREF _Toc242625806 \h </w:instrText>
             </w:r>
             <w:r>
               <w:rPr>
@@ -973,7 +973,7 @@
               <w14:ligatures w14:val="standardContextual"/>
             </w:rPr>
           </w:pPr>
-          <w:hyperlink w:anchor="_Toc242612433" w:history="1">
+          <w:hyperlink w:anchor="_Toc242625807" w:history="1">
             <w:r>
               <w:rPr>
                 <w:rStyle w:val="Hypertextovodkaz"/>
@@ -997,7 +997,7 @@
               <w:rPr>
                 <w:noProof/>
               </w:rPr>
-              <w:instrText xml:space="preserve"> PAGEREF _Toc242612433 \h </w:instrText>
+              <w:instrText xml:space="preserve"> PAGEREF _Toc242625807 \h </w:instrText>
             </w:r>
             <w:r>
               <w:rPr>
@@ -1040,7 +1040,7 @@
               <w14:ligatures w14:val="standardContextual"/>
             </w:rPr>
           </w:pPr>
-          <w:hyperlink w:anchor="_Toc242612434" w:history="1">
+          <w:hyperlink w:anchor="_Toc242625808" w:history="1">
             <w:r>
               <w:rPr>
                 <w:rStyle w:val="Hypertextovodkaz"/>
@@ -1064,7 +1064,7 @@
               <w:rPr>
                 <w:noProof/>
               </w:rPr>
-              <w:instrText xml:space="preserve"> PAGEREF _Toc242612434 \h </w:instrText>
+              <w:instrText xml:space="preserve"> PAGEREF _Toc242625808 \h </w:instrText>
             </w:r>
             <w:r>
               <w:rPr>
@@ -1107,7 +1107,7 @@
               <w14:ligatures w14:val="standardContextual"/>
             </w:rPr>
           </w:pPr>
-          <w:hyperlink w:anchor="_Toc242612435" w:history="1">
+          <w:hyperlink w:anchor="_Toc242625809" w:history="1">
             <w:r>
               <w:rPr>
                 <w:rStyle w:val="Hypertextovodkaz"/>
@@ -1131,7 +1131,7 @@
               <w:rPr>
                 <w:noProof/>
               </w:rPr>
-              <w:instrText xml:space="preserve"> PAGEREF _Toc242612435 \h </w:instrText>
+              <w:instrText xml:space="preserve"> PAGEREF _Toc242625809 \h </w:instrText>
             </w:r>
             <w:r>
               <w:rPr>
@@ -1174,7 +1174,7 @@
               <w14:ligatures w14:val="standardContextual"/>
             </w:rPr>
           </w:pPr>
-          <w:hyperlink w:anchor="_Toc242612436" w:history="1">
+          <w:hyperlink w:anchor="_Toc242625810" w:history="1">
             <w:r>
               <w:rPr>
                 <w:rStyle w:val="Hypertextovodkaz"/>
@@ -1198,7 +1198,7 @@
               <w:rPr>
                 <w:noProof/>
               </w:rPr>
-              <w:instrText xml:space="preserve"> PAGEREF _Toc242612436 \h </w:instrText>
+              <w:instrText xml:space="preserve"> PAGEREF _Toc242625810 \h </w:instrText>
             </w:r>
             <w:r>
               <w:rPr>
@@ -1241,7 +1241,7 @@
               <w14:ligatures w14:val="standardContextual"/>
             </w:rPr>
           </w:pPr>
-          <w:hyperlink w:anchor="_Toc242612437" w:history="1">
+          <w:hyperlink w:anchor="_Toc242625811" w:history="1">
             <w:r>
               <w:rPr>
                 <w:rStyle w:val="Hypertextovodkaz"/>
@@ -1265,7 +1265,7 @@
               <w:rPr>
                 <w:noProof/>
               </w:rPr>
-              <w:instrText xml:space="preserve"> PAGEREF _Toc242612437 \h </w:instrText>
+              <w:instrText xml:space="preserve"> PAGEREF _Toc242625811 \h </w:instrText>
             </w:r>
             <w:r>
               <w:rPr>
@@ -1308,7 +1308,7 @@
               <w14:ligatures w14:val="standardContextual"/>
             </w:rPr>
           </w:pPr>
-          <w:hyperlink w:anchor="_Toc242612438" w:history="1">
+          <w:hyperlink w:anchor="_Toc242625812" w:history="1">
             <w:r>
               <w:rPr>
                 <w:rStyle w:val="Hypertextovodkaz"/>
@@ -1332,7 +1332,7 @@
               <w:rPr>
                 <w:noProof/>
               </w:rPr>
-              <w:instrText xml:space="preserve"> PAGEREF _Toc242612438 \h </w:instrText>
+              <w:instrText xml:space="preserve"> PAGEREF _Toc242625812 \h </w:instrText>
             </w:r>
             <w:r>
               <w:rPr>
@@ -1375,7 +1375,7 @@
               <w14:ligatures w14:val="standardContextual"/>
             </w:rPr>
           </w:pPr>
-          <w:hyperlink w:anchor="_Toc242612439" w:history="1">
+          <w:hyperlink w:anchor="_Toc242625813" w:history="1">
             <w:r>
               <w:rPr>
                 <w:rStyle w:val="Hypertextovodkaz"/>
@@ -1399,7 +1399,7 @@
               <w:rPr>
                 <w:noProof/>
               </w:rPr>
-              <w:instrText xml:space="preserve"> PAGEREF _Toc242612439 \h </w:instrText>
+              <w:instrText xml:space="preserve"> PAGEREF _Toc242625813 \h </w:instrText>
             </w:r>
             <w:r>
               <w:rPr>
@@ -1442,7 +1442,7 @@
               <w14:ligatures w14:val="standardContextual"/>
             </w:rPr>
           </w:pPr>
-          <w:hyperlink w:anchor="_Toc242612440" w:history="1">
+          <w:hyperlink w:anchor="_Toc242625814" w:history="1">
             <w:r>
               <w:rPr>
                 <w:rStyle w:val="Hypertextovodkaz"/>
@@ -1466,7 +1466,7 @@
               <w:rPr>
                 <w:noProof/>
               </w:rPr>
-              <w:instrText xml:space="preserve"> PAGEREF _Toc242612440 \h </w:instrText>
+              <w:instrText xml:space="preserve"> PAGEREF _Toc242625814 \h </w:instrText>
             </w:r>
             <w:r>
               <w:rPr>
@@ -1509,7 +1509,7 @@
               <w14:ligatures w14:val="standardContextual"/>
             </w:rPr>
           </w:pPr>
-          <w:hyperlink w:anchor="_Toc242612441" w:history="1">
+          <w:hyperlink w:anchor="_Toc242625815" w:history="1">
             <w:r>
               <w:rPr>
                 <w:rStyle w:val="Hypertextovodkaz"/>
@@ -1533,7 +1533,7 @@
               <w:rPr>
                 <w:noProof/>
               </w:rPr>
-              <w:instrText xml:space="preserve"> PAGEREF _Toc242612441 \h </w:instrText>
+              <w:instrText xml:space="preserve"> PAGEREF _Toc242625815 \h </w:instrText>
             </w:r>
             <w:r>
               <w:rPr>
@@ -1576,7 +1576,7 @@
               <w14:ligatures w14:val="standardContextual"/>
             </w:rPr>
           </w:pPr>
-          <w:hyperlink w:anchor="_Toc242612442" w:history="1">
+          <w:hyperlink w:anchor="_Toc242625816" w:history="1">
             <w:r>
               <w:rPr>
                 <w:rStyle w:val="Hypertextovodkaz"/>
@@ -1600,7 +1600,7 @@
               <w:rPr>
                 <w:noProof/>
               </w:rPr>
-              <w:instrText xml:space="preserve"> PAGEREF _Toc242612442 \h </w:instrText>
+              <w:instrText xml:space="preserve"> PAGEREF _Toc242625816 \h </w:instrText>
             </w:r>
             <w:r>
               <w:rPr>
@@ -1643,7 +1643,7 @@
               <w14:ligatures w14:val="standardContextual"/>
             </w:rPr>
           </w:pPr>
-          <w:hyperlink w:anchor="_Toc242612443" w:history="1">
+          <w:hyperlink w:anchor="_Toc242625817" w:history="1">
             <w:r>
               <w:rPr>
                 <w:rStyle w:val="Hypertextovodkaz"/>
@@ -1667,7 +1667,7 @@
               <w:rPr>
                 <w:noProof/>
               </w:rPr>
-              <w:instrText xml:space="preserve"> PAGEREF _Toc242612443 \h </w:instrText>
+              <w:instrText xml:space="preserve"> PAGEREF _Toc242625817 \h </w:instrText>
             </w:r>
             <w:r>
               <w:rPr>
@@ -1710,7 +1710,7 @@
               <w14:ligatures w14:val="standardContextual"/>
             </w:rPr>
           </w:pPr>
-          <w:hyperlink w:anchor="_Toc242612444" w:history="1">
+          <w:hyperlink w:anchor="_Toc242625818" w:history="1">
             <w:r>
               <w:rPr>
                 <w:rStyle w:val="Hypertextovodkaz"/>
@@ -1734,7 +1734,7 @@
               <w:rPr>
                 <w:noProof/>
               </w:rPr>
-              <w:instrText xml:space="preserve"> PAGEREF _Toc242612444 \h </w:instrText>
+              <w:instrText xml:space="preserve"> PAGEREF _Toc242625818 \h </w:instrText>
             </w:r>
             <w:r>
               <w:rPr>
@@ -1777,7 +1777,7 @@
               <w14:ligatures w14:val="standardContextual"/>
             </w:rPr>
           </w:pPr>
-          <w:hyperlink w:anchor="_Toc242612445" w:history="1">
+          <w:hyperlink w:anchor="_Toc242625819" w:history="1">
             <w:r>
               <w:rPr>
                 <w:rStyle w:val="Hypertextovodkaz"/>
@@ -1801,7 +1801,7 @@
               <w:rPr>
                 <w:noProof/>
               </w:rPr>
-              <w:instrText xml:space="preserve"> PAGEREF _Toc242612445 \h </w:instrText>
+              <w:instrText xml:space="preserve"> PAGEREF _Toc242625819 \h </w:instrText>
             </w:r>
             <w:r>
               <w:rPr>
@@ -1844,7 +1844,7 @@
               <w14:ligatures w14:val="standardContextual"/>
             </w:rPr>
           </w:pPr>
-          <w:hyperlink w:anchor="_Toc242612446" w:history="1">
+          <w:hyperlink w:anchor="_Toc242625820" w:history="1">
             <w:r>
               <w:rPr>
                 <w:rStyle w:val="Hypertextovodkaz"/>
@@ -1868,7 +1868,7 @@
               <w:rPr>
                 <w:noProof/>
               </w:rPr>
-              <w:instrText xml:space="preserve"> PAGEREF _Toc242612446 \h </w:instrText>
+              <w:instrText xml:space="preserve"> PAGEREF _Toc242625820 \h </w:instrText>
             </w:r>
             <w:r>
               <w:rPr>
@@ -1911,7 +1911,7 @@
               <w14:ligatures w14:val="standardContextual"/>
             </w:rPr>
           </w:pPr>
-          <w:hyperlink w:anchor="_Toc242612447" w:history="1">
+          <w:hyperlink w:anchor="_Toc242625821" w:history="1">
             <w:r>
               <w:rPr>
                 <w:rStyle w:val="Hypertextovodkaz"/>
@@ -1935,7 +1935,7 @@
               <w:rPr>
                 <w:noProof/>
               </w:rPr>
-              <w:instrText xml:space="preserve"> PAGEREF _Toc242612447 \h </w:instrText>
+              <w:instrText xml:space="preserve"> PAGEREF _Toc242625821 \h </w:instrText>
             </w:r>
             <w:r>
               <w:rPr>
@@ -1978,7 +1978,7 @@
               <w14:ligatures w14:val="standardContextual"/>
             </w:rPr>
           </w:pPr>
-          <w:hyperlink w:anchor="_Toc242612448" w:history="1">
+          <w:hyperlink w:anchor="_Toc242625822" w:history="1">
             <w:r>
               <w:rPr>
                 <w:rStyle w:val="Hypertextovodkaz"/>
@@ -2002,7 +2002,7 @@
               <w:rPr>
                 <w:noProof/>
               </w:rPr>
-              <w:instrText xml:space="preserve"> PAGEREF _Toc242612448 \h </w:instrText>
+              <w:instrText xml:space="preserve"> PAGEREF _Toc242625822 \h </w:instrText>
             </w:r>
             <w:r>
               <w:rPr>
@@ -2045,7 +2045,7 @@
               <w14:ligatures w14:val="standardContextual"/>
             </w:rPr>
           </w:pPr>
-          <w:hyperlink w:anchor="_Toc242612449" w:history="1">
+          <w:hyperlink w:anchor="_Toc242625823" w:history="1">
             <w:r>
               <w:rPr>
                 <w:rStyle w:val="Hypertextovodkaz"/>
@@ -2069,7 +2069,7 @@
               <w:rPr>
                 <w:noProof/>
               </w:rPr>
-              <w:instrText xml:space="preserve"> PAGEREF _Toc242612449 \h </w:instrText>
+              <w:instrText xml:space="preserve"> PAGEREF _Toc242625823 \h </w:instrText>
             </w:r>
             <w:r>
               <w:rPr>
@@ -2112,7 +2112,7 @@
               <w14:ligatures w14:val="standardContextual"/>
             </w:rPr>
           </w:pPr>
-          <w:hyperlink w:anchor="_Toc242612450" w:history="1">
+          <w:hyperlink w:anchor="_Toc242625824" w:history="1">
             <w:r>
               <w:rPr>
                 <w:rStyle w:val="Hypertextovodkaz"/>
@@ -2136,7 +2136,7 @@
               <w:rPr>
                 <w:noProof/>
               </w:rPr>
-              <w:instrText xml:space="preserve"> PAGEREF _Toc242612450 \h </w:instrText>
+              <w:instrText xml:space="preserve"> PAGEREF _Toc242625824 \h </w:instrText>
             </w:r>
             <w:r>
               <w:rPr>
@@ -2179,7 +2179,7 @@
               <w14:ligatures w14:val="standardContextual"/>
             </w:rPr>
           </w:pPr>
-          <w:hyperlink w:anchor="_Toc242612451" w:history="1">
+          <w:hyperlink w:anchor="_Toc242625825" w:history="1">
             <w:r>
               <w:rPr>
                 <w:rStyle w:val="Hypertextovodkaz"/>
@@ -2203,7 +2203,7 @@
               <w:rPr>
                 <w:noProof/>
               </w:rPr>
-              <w:instrText xml:space="preserve"> PAGEREF _Toc242612451 \h </w:instrText>
+              <w:instrText xml:space="preserve"> PAGEREF _Toc242625825 \h </w:instrText>
             </w:r>
             <w:r>
               <w:rPr>
@@ -2246,7 +2246,7 @@
               <w14:ligatures w14:val="standardContextual"/>
             </w:rPr>
           </w:pPr>
-          <w:hyperlink w:anchor="_Toc242612452" w:history="1">
+          <w:hyperlink w:anchor="_Toc242625826" w:history="1">
             <w:r>
               <w:rPr>
                 <w:rStyle w:val="Hypertextovodkaz"/>
@@ -2270,7 +2270,7 @@
               <w:rPr>
                 <w:noProof/>
               </w:rPr>
-              <w:instrText xml:space="preserve"> PAGEREF _Toc242612452 \h </w:instrText>
+              <w:instrText xml:space="preserve"> PAGEREF _Toc242625826 \h </w:instrText>
             </w:r>
             <w:r>
               <w:rPr>
@@ -2313,7 +2313,7 @@
               <w14:ligatures w14:val="standardContextual"/>
             </w:rPr>
           </w:pPr>
-          <w:hyperlink w:anchor="_Toc242612453" w:history="1">
+          <w:hyperlink w:anchor="_Toc242625827" w:history="1">
             <w:r>
               <w:rPr>
                 <w:rStyle w:val="Hypertextovodkaz"/>
@@ -2337,7 +2337,7 @@
               <w:rPr>
                 <w:noProof/>
               </w:rPr>
-              <w:instrText xml:space="preserve"> PAGEREF _Toc242612453 \h </w:instrText>
+              <w:instrText xml:space="preserve"> PAGEREF _Toc242625827 \h </w:instrText>
             </w:r>
             <w:r>
               <w:rPr>
@@ -2380,7 +2380,7 @@
               <w14:ligatures w14:val="standardContextual"/>
             </w:rPr>
           </w:pPr>
-          <w:hyperlink w:anchor="_Toc242612454" w:history="1">
+          <w:hyperlink w:anchor="_Toc242625828" w:history="1">
             <w:r>
               <w:rPr>
                 <w:rStyle w:val="Hypertextovodkaz"/>
@@ -2404,7 +2404,7 @@
               <w:rPr>
                 <w:noProof/>
               </w:rPr>
-              <w:instrText xml:space="preserve"> PAGEREF _Toc242612454 \h </w:instrText>
+              <w:instrText xml:space="preserve"> PAGEREF _Toc242625828 \h </w:instrText>
             </w:r>
             <w:r>
               <w:rPr>
@@ -2447,7 +2447,7 @@
               <w14:ligatures w14:val="standardContextual"/>
             </w:rPr>
           </w:pPr>
-          <w:hyperlink w:anchor="_Toc242612455" w:history="1">
+          <w:hyperlink w:anchor="_Toc242625829" w:history="1">
             <w:r>
               <w:rPr>
                 <w:rStyle w:val="Hypertextovodkaz"/>
@@ -2471,7 +2471,7 @@
               <w:rPr>
                 <w:noProof/>
               </w:rPr>
-              <w:instrText xml:space="preserve"> PAGEREF _Toc242612455 \h </w:instrText>
+              <w:instrText xml:space="preserve"> PAGEREF _Toc242625829 \h </w:instrText>
             </w:r>
             <w:r>
               <w:rPr>
@@ -2514,7 +2514,7 @@
               <w14:ligatures w14:val="standardContextual"/>
             </w:rPr>
           </w:pPr>
-          <w:hyperlink w:anchor="_Toc242612456" w:history="1">
+          <w:hyperlink w:anchor="_Toc242625830" w:history="1">
             <w:r>
               <w:rPr>
                 <w:rStyle w:val="Hypertextovodkaz"/>
@@ -2538,7 +2538,7 @@
               <w:rPr>
                 <w:noProof/>
               </w:rPr>
-              <w:instrText xml:space="preserve"> PAGEREF _Toc242612456 \h </w:instrText>
+              <w:instrText xml:space="preserve"> PAGEREF _Toc242625830 \h </w:instrText>
             </w:r>
             <w:r>
               <w:rPr>
@@ -2581,7 +2581,7 @@
               <w14:ligatures w14:val="standardContextual"/>
             </w:rPr>
           </w:pPr>
-          <w:hyperlink w:anchor="_Toc242612457" w:history="1">
+          <w:hyperlink w:anchor="_Toc242625831" w:history="1">
             <w:r>
               <w:rPr>
                 <w:rStyle w:val="Hypertextovodkaz"/>
@@ -2605,7 +2605,7 @@
               <w:rPr>
                 <w:noProof/>
               </w:rPr>
-              <w:instrText xml:space="preserve"> PAGEREF _Toc242612457 \h </w:instrText>
+              <w:instrText xml:space="preserve"> PAGEREF _Toc242625831 \h </w:instrText>
             </w:r>
             <w:r>
               <w:rPr>
@@ -2654,7 +2654,7 @@
         <w:pStyle w:val="Nadpis1"/>
         <w:pageBreakBefore/>
       </w:pPr>
-      <w:bookmarkStart w:id="0" w:name="_Toc242612424"/>
+      <w:bookmarkStart w:id="0" w:name="_Toc242625798"/>
       <w:r>
         <w:t>1  Introduction</w:t>
       </w:r>
@@ -2664,7 +2664,7 @@
       <w:pPr>
         <w:pStyle w:val="Nadpis2"/>
       </w:pPr>
-      <w:bookmarkStart w:id="1" w:name="_Toc242612425"/>
+      <w:bookmarkStart w:id="1" w:name="_Toc242625799"/>
       <w:r>
         <w:t>1.1  What the application is for</w:t>
       </w:r>
@@ -2835,7 +2835,7 @@
       <w:pPr>
         <w:pStyle w:val="Nadpis2"/>
       </w:pPr>
-      <w:bookmarkStart w:id="2" w:name="_Toc242612426"/>
+      <w:bookmarkStart w:id="2" w:name="_Toc242625800"/>
       <w:r>
         <w:t>1.2  Where the application runs and how to open it</w:t>
       </w:r>
@@ -2905,7 +2905,7 @@
       <w:pPr>
         <w:pStyle w:val="Nadpis2"/>
       </w:pPr>
-      <w:bookmarkStart w:id="3" w:name="_Toc242612427"/>
+      <w:bookmarkStart w:id="3" w:name="_Toc242625801"/>
       <w:r>
         <w:t>1.3  User roles</w:t>
       </w:r>
@@ -4293,7 +4293,7 @@
       <w:pPr>
         <w:pStyle w:val="Nadpis2"/>
       </w:pPr>
-      <w:bookmarkStart w:id="4" w:name="_Toc242612428"/>
+      <w:bookmarkStart w:id="4" w:name="_Toc242625802"/>
       <w:r>
         <w:t>1.4  About this manual</w:t>
       </w:r>
@@ -4312,7 +4312,7 @@
         <w:pStyle w:val="Nadpis1"/>
         <w:pageBreakBefore/>
       </w:pPr>
-      <w:bookmarkStart w:id="5" w:name="_Toc242612429"/>
+      <w:bookmarkStart w:id="5" w:name="_Toc242625803"/>
       <w:r>
         <w:t>2  Sign-in and basic controls</w:t>
       </w:r>
@@ -4322,7 +4322,7 @@
       <w:pPr>
         <w:pStyle w:val="Nadpis2"/>
       </w:pPr>
-      <w:bookmarkStart w:id="6" w:name="_Toc242612430"/>
+      <w:bookmarkStart w:id="6" w:name="_Toc242625804"/>
       <w:r>
         <w:t>2.1  Signing in</w:t>
       </w:r>
@@ -4339,7 +4339,7 @@
           <w:noProof/>
         </w:rPr>
         <w:drawing>
-          <wp:inline distT="0" distB="0" distL="0" distR="0" wp14:anchorId="624881E1" wp14:editId="12AB86E5">
+          <wp:inline distT="0" distB="0" distL="0" distR="0" wp14:anchorId="4EEFDE50" wp14:editId="63308956">
             <wp:extent cx="3800475" cy="2133600"/>
             <wp:effectExtent l="0" t="0" r="0" b="0"/>
             <wp:docPr id="1" name="01_login" descr="Sign-in screen" title="Sign-in screen"/>
@@ -4472,7 +4472,7 @@
       <w:pPr>
         <w:pStyle w:val="Nadpis2"/>
       </w:pPr>
-      <w:bookmarkStart w:id="7" w:name="_Toc242612431"/>
+      <w:bookmarkStart w:id="7" w:name="_Toc242625805"/>
       <w:r>
         <w:t>2.2  Top bar</w:t>
       </w:r>
@@ -4489,7 +4489,7 @@
           <w:noProof/>
         </w:rPr>
         <w:drawing>
-          <wp:inline distT="0" distB="0" distL="0" distR="0" wp14:anchorId="5962BB6F" wp14:editId="3BBD6CAA">
+          <wp:inline distT="0" distB="0" distL="0" distR="0" wp14:anchorId="5811A61F" wp14:editId="381ED319">
             <wp:extent cx="6124575" cy="209550"/>
             <wp:effectExtent l="0" t="0" r="0" b="0"/>
             <wp:docPr id="2" name="02b_topbar" descr="Top bar" title="Top bar"/>
@@ -5196,7 +5196,7 @@
       <w:pPr>
         <w:pStyle w:val="Nadpis2"/>
       </w:pPr>
-      <w:bookmarkStart w:id="8" w:name="_Toc242612432"/>
+      <w:bookmarkStart w:id="8" w:name="_Toc242625806"/>
       <w:r>
         <w:t>2.3  Menu and controls</w:t>
       </w:r>
@@ -5298,7 +5298,7 @@
         <w:pStyle w:val="Nadpis1"/>
         <w:pageBreakBefore/>
       </w:pPr>
-      <w:bookmarkStart w:id="9" w:name="_Toc242612433"/>
+      <w:bookmarkStart w:id="9" w:name="_Toc242625807"/>
       <w:r>
         <w:t>3  Database</w:t>
       </w:r>
@@ -5323,7 +5323,7 @@
           <w:noProof/>
         </w:rPr>
         <w:drawing>
-          <wp:inline distT="0" distB="0" distL="0" distR="0" wp14:anchorId="6CFE7957" wp14:editId="7981F8A9">
+          <wp:inline distT="0" distB="0" distL="0" distR="0" wp14:anchorId="119525C6" wp14:editId="21D6DF8B">
             <wp:extent cx="6124575" cy="3448050"/>
             <wp:effectExtent l="0" t="0" r="0" b="0"/>
             <wp:docPr id="3" name="02_database" descr="Database — orders on the machine PC" title="Database — orders on the machine PC"/>
@@ -5390,7 +5390,7 @@
       <w:pPr>
         <w:pStyle w:val="Nadpis2"/>
       </w:pPr>
-      <w:bookmarkStart w:id="10" w:name="_Toc242612434"/>
+      <w:bookmarkStart w:id="10" w:name="_Toc242625808"/>
       <w:r>
         <w:t>3.1  Order list</w:t>
       </w:r>
@@ -6233,7 +6233,7 @@
       <w:pPr>
         <w:pStyle w:val="Nadpis2"/>
       </w:pPr>
-      <w:bookmarkStart w:id="11" w:name="_Toc242612435"/>
+      <w:bookmarkStart w:id="11" w:name="_Toc242625809"/>
       <w:r>
         <w:t>3.2  Switches, date filter and sorting</w:t>
       </w:r>
@@ -6250,7 +6250,7 @@
           <w:noProof/>
         </w:rPr>
         <w:drawing>
-          <wp:inline distT="0" distB="0" distL="0" distR="0" wp14:anchorId="0A2D678E" wp14:editId="0AEA6551">
+          <wp:inline distT="0" distB="0" distL="0" distR="0" wp14:anchorId="4B4A9D54" wp14:editId="08828473">
             <wp:extent cx="6124575" cy="342900"/>
             <wp:effectExtent l="0" t="0" r="0" b="0"/>
             <wp:docPr id="4" name="02d_controls" descr="Database header: storage indicator and switches" title="Database header: storage indicator and switches"/>
@@ -6447,7 +6447,7 @@
       <w:pPr>
         <w:pStyle w:val="Nadpis2"/>
       </w:pPr>
-      <w:bookmarkStart w:id="12" w:name="_Toc242612436"/>
+      <w:bookmarkStart w:id="12" w:name="_Toc242625810"/>
       <w:r>
         <w:t>3.3  Expanding an order</w:t>
       </w:r>
@@ -6482,7 +6482,7 @@
           <w:noProof/>
         </w:rPr>
         <w:drawing>
-          <wp:inline distT="0" distB="0" distL="0" distR="0" wp14:anchorId="5D3D86C7" wp14:editId="1C685C88">
+          <wp:inline distT="0" distB="0" distL="0" distR="0" wp14:anchorId="121FD698" wp14:editId="6A783C24">
             <wp:extent cx="6124575" cy="3448050"/>
             <wp:effectExtent l="0" t="0" r="0" b="0"/>
             <wp:docPr id="5" name="03_expanded" descr="Order expanded in the list" title="Order expanded in the list"/>
@@ -6549,7 +6549,7 @@
       <w:pPr>
         <w:pStyle w:val="Nadpis2"/>
       </w:pPr>
-      <w:bookmarkStart w:id="13" w:name="_Toc242612437"/>
+      <w:bookmarkStart w:id="13" w:name="_Toc242625811"/>
       <w:r>
         <w:t>3.4  Downloading data</w:t>
       </w:r>
@@ -6599,7 +6599,7 @@
       <w:pPr>
         <w:pStyle w:val="Nadpis2"/>
       </w:pPr>
-      <w:bookmarkStart w:id="14" w:name="_Toc242612438"/>
+      <w:bookmarkStart w:id="14" w:name="_Toc242625812"/>
       <w:r>
         <w:t>3.5  Deleting files</w:t>
       </w:r>
@@ -6654,7 +6654,7 @@
           <w:noProof/>
         </w:rPr>
         <w:drawing>
-          <wp:inline distT="0" distB="0" distL="0" distR="0" wp14:anchorId="6AB297E2" wp14:editId="6079A812">
+          <wp:inline distT="0" distB="0" distL="0" distR="0" wp14:anchorId="21A81064" wp14:editId="4789819A">
             <wp:extent cx="6124575" cy="3448050"/>
             <wp:effectExtent l="0" t="0" r="0" b="0"/>
             <wp:docPr id="6" name="05_selection" descr="Selecting several files for batch deletion" title="Selecting several files for batch deletion"/>
@@ -6742,7 +6742,7 @@
       <w:pPr>
         <w:pStyle w:val="Nadpis2"/>
       </w:pPr>
-      <w:bookmarkStart w:id="15" w:name="_Toc242612439"/>
+      <w:bookmarkStart w:id="15" w:name="_Toc242625813"/>
       <w:r>
         <w:t>3.6  Remote storage (NAS)</w:t>
       </w:r>
@@ -6777,7 +6777,7 @@
           <w:noProof/>
         </w:rPr>
         <w:drawing>
-          <wp:inline distT="0" distB="0" distL="0" distR="0" wp14:anchorId="363194C1" wp14:editId="27247E44">
+          <wp:inline distT="0" distB="0" distL="0" distR="0" wp14:anchorId="013DD068" wp14:editId="3B70E8FE">
             <wp:extent cx="6124575" cy="3448050"/>
             <wp:effectExtent l="0" t="0" r="0" b="0"/>
             <wp:docPr id="7" name="06_remote" descr="Orders on the NAS" title="Orders on the NAS"/>
@@ -6844,7 +6844,7 @@
       <w:pPr>
         <w:pStyle w:val="Nadpis2"/>
       </w:pPr>
-      <w:bookmarkStart w:id="16" w:name="_Toc242612440"/>
+      <w:bookmarkStart w:id="16" w:name="_Toc242625814"/>
       <w:r>
         <w:t>3.7  Local storage and clean-up</w:t>
       </w:r>
@@ -6861,7 +6861,7 @@
           <w:noProof/>
         </w:rPr>
         <w:drawing>
-          <wp:inline distT="0" distB="0" distL="0" distR="0" wp14:anchorId="3E0CBB7D" wp14:editId="09817A83">
+          <wp:inline distT="0" distB="0" distL="0" distR="0" wp14:anchorId="75A72F7D" wp14:editId="29D5C433">
             <wp:extent cx="2162175" cy="342900"/>
             <wp:effectExtent l="0" t="0" r="0" b="0"/>
             <wp:docPr id="8" name="04a_storagebar" descr="Local storage indicator" title="Local storage indicator"/>
@@ -7002,7 +7002,7 @@
           <w:noProof/>
         </w:rPr>
         <w:drawing>
-          <wp:inline distT="0" distB="0" distL="0" distR="0" wp14:anchorId="4745ADBC" wp14:editId="5726DD56">
+          <wp:inline distT="0" distB="0" distL="0" distR="0" wp14:anchorId="08D4A0B0" wp14:editId="60253057">
             <wp:extent cx="2647950" cy="1981200"/>
             <wp:effectExtent l="0" t="0" r="0" b="0"/>
             <wp:docPr id="9" name="04_storage" descr="Confirming clean-up of synced files" title="Confirming clean-up of synced files"/>
@@ -7090,7 +7090,7 @@
       <w:pPr>
         <w:pStyle w:val="Nadpis2"/>
       </w:pPr>
-      <w:bookmarkStart w:id="17" w:name="_Toc242612441"/>
+      <w:bookmarkStart w:id="17" w:name="_Toc242625815"/>
       <w:r>
         <w:t>3.8  Tests (Testing)</w:t>
       </w:r>
@@ -7125,7 +7125,7 @@
           <w:noProof/>
         </w:rPr>
         <w:drawing>
-          <wp:inline distT="0" distB="0" distL="0" distR="0" wp14:anchorId="0906167F" wp14:editId="4999A8FA">
+          <wp:inline distT="0" distB="0" distL="0" distR="0" wp14:anchorId="0DBC607C" wp14:editId="0ECE3796">
             <wp:extent cx="6124575" cy="3448050"/>
             <wp:effectExtent l="0" t="0" r="0" b="0"/>
             <wp:docPr id="10" name="07_testing_list" descr="Test list" title="Test list"/>
@@ -7193,7 +7193,7 @@
         <w:pStyle w:val="Nadpis1"/>
         <w:pageBreakBefore/>
       </w:pPr>
-      <w:bookmarkStart w:id="18" w:name="_Toc242612442"/>
+      <w:bookmarkStart w:id="18" w:name="_Toc242625816"/>
       <w:r>
         <w:t>4  Order detail</w:t>
       </w:r>
@@ -7238,7 +7238,7 @@
           <w:noProof/>
         </w:rPr>
         <w:drawing>
-          <wp:inline distT="0" distB="0" distL="0" distR="0" wp14:anchorId="26F46A6B" wp14:editId="09A35E6B">
+          <wp:inline distT="0" distB="0" distL="0" distR="0" wp14:anchorId="1837345C" wp14:editId="18E0701C">
             <wp:extent cx="6124575" cy="3448050"/>
             <wp:effectExtent l="0" t="0" r="0" b="0"/>
             <wp:docPr id="11" name="08_order" descr="Order detail — header and category distribution" title="Order detail — header and category distribution"/>
@@ -7305,7 +7305,7 @@
       <w:pPr>
         <w:pStyle w:val="Nadpis2"/>
       </w:pPr>
-      <w:bookmarkStart w:id="19" w:name="_Toc242612443"/>
+      <w:bookmarkStart w:id="19" w:name="_Toc242625817"/>
       <w:r>
         <w:t>4.1  Header and category distribution</w:t>
       </w:r>
@@ -7638,7 +7638,7 @@
       <w:pPr>
         <w:pStyle w:val="Nadpis2"/>
       </w:pPr>
-      <w:bookmarkStart w:id="20" w:name="_Toc242612444"/>
+      <w:bookmarkStart w:id="20" w:name="_Toc242625818"/>
       <w:r>
         <w:t>4.2  Timeline</w:t>
       </w:r>
@@ -7673,7 +7673,7 @@
           <w:noProof/>
         </w:rPr>
         <w:drawing>
-          <wp:inline distT="0" distB="0" distL="0" distR="0" wp14:anchorId="5B69F6A7" wp14:editId="0B283EF6">
+          <wp:inline distT="0" distB="0" distL="0" distR="0" wp14:anchorId="7539AEF8" wp14:editId="40FA6744">
             <wp:extent cx="6124575" cy="1990725"/>
             <wp:effectExtent l="0" t="0" r="0" b="0"/>
             <wp:docPr id="12" name="09_timeline" descr="Order timeline" title="Order timeline"/>
@@ -8250,7 +8250,7 @@
       <w:pPr>
         <w:pStyle w:val="Nadpis2"/>
       </w:pPr>
-      <w:bookmarkStart w:id="21" w:name="_Toc242612445"/>
+      <w:bookmarkStart w:id="21" w:name="_Toc242625819"/>
       <w:r>
         <w:t>4.3  Piece table and filter</w:t>
       </w:r>
@@ -8325,7 +8325,7 @@
           <w:noProof/>
         </w:rPr>
         <w:drawing>
-          <wp:inline distT="0" distB="0" distL="0" distR="0" wp14:anchorId="22041220" wp14:editId="1138164B">
+          <wp:inline distT="0" distB="0" distL="0" distR="0" wp14:anchorId="61586941" wp14:editId="17CABC61">
             <wp:extent cx="6124575" cy="3829050"/>
             <wp:effectExtent l="0" t="0" r="0" b="0"/>
             <wp:docPr id="13" name="10b_tabs" descr="Piece table — Positions group" title="Piece table — Positions group"/>
@@ -8483,7 +8483,7 @@
           <w:noProof/>
         </w:rPr>
         <w:drawing>
-          <wp:inline distT="0" distB="0" distL="0" distR="0" wp14:anchorId="2FBBE55B" wp14:editId="565AB10B">
+          <wp:inline distT="0" distB="0" distL="0" distR="0" wp14:anchorId="57A99FF1" wp14:editId="2169BE10">
             <wp:extent cx="6124575" cy="2247900"/>
             <wp:effectExtent l="0" t="0" r="0" b="0"/>
             <wp:docPr id="14" name="11_filter" descr="Filter — NOK pieces only" title="Filter — NOK pieces only"/>
@@ -8550,7 +8550,7 @@
       <w:pPr>
         <w:pStyle w:val="Nadpis2"/>
       </w:pPr>
-      <w:bookmarkStart w:id="22" w:name="_Toc242612446"/>
+      <w:bookmarkStart w:id="22" w:name="_Toc242625820"/>
       <w:r>
         <w:t>4.4  Exporting and printing an order</w:t>
       </w:r>
@@ -8602,7 +8602,7 @@
         <w:pStyle w:val="Nadpis1"/>
         <w:pageBreakBefore/>
       </w:pPr>
-      <w:bookmarkStart w:id="23" w:name="_Toc242612447"/>
+      <w:bookmarkStart w:id="23" w:name="_Toc242625821"/>
       <w:r>
         <w:t>5  Record detail (one piece)</w:t>
       </w:r>
@@ -8627,7 +8627,7 @@
           <w:noProof/>
         </w:rPr>
         <w:drawing>
-          <wp:inline distT="0" distB="0" distL="0" distR="0" wp14:anchorId="7046DCCB" wp14:editId="699143DE">
+          <wp:inline distT="0" distB="0" distL="0" distR="0" wp14:anchorId="70AD39A9" wp14:editId="4089FE08">
             <wp:extent cx="6124575" cy="3448050"/>
             <wp:effectExtent l="0" t="0" r="0" b="0"/>
             <wp:docPr id="15" name="13_record" descr="Record detail — diagrams" title="Record detail — diagrams"/>
@@ -8795,7 +8795,7 @@
           <w:noProof/>
         </w:rPr>
         <w:drawing>
-          <wp:inline distT="0" distB="0" distL="0" distR="0" wp14:anchorId="04E579B0" wp14:editId="727A06D6">
+          <wp:inline distT="0" distB="0" distL="0" distR="0" wp14:anchorId="08E359A4" wp14:editId="14F2AF2A">
             <wp:extent cx="3800475" cy="5372100"/>
             <wp:effectExtent l="0" t="0" r="0" b="0"/>
             <wp:docPr id="16" name="12_print_record" descr="Printed record report (page 1)" title="Printed record report (page 1)"/>
@@ -8884,7 +8884,7 @@
         <w:pStyle w:val="Nadpis1"/>
         <w:pageBreakBefore/>
       </w:pPr>
-      <w:bookmarkStart w:id="24" w:name="_Toc242612448"/>
+      <w:bookmarkStart w:id="24" w:name="_Toc242625822"/>
       <w:r>
         <w:t>6  Test detail (Testing)</w:t>
       </w:r>
@@ -8909,7 +8909,7 @@
           <w:noProof/>
         </w:rPr>
         <w:drawing>
-          <wp:inline distT="0" distB="0" distL="0" distR="0" wp14:anchorId="4E653EE5" wp14:editId="1D2ABA79">
+          <wp:inline distT="0" distB="0" distL="0" distR="0" wp14:anchorId="3D3695C8" wp14:editId="721CE3FB">
             <wp:extent cx="6124575" cy="3448050"/>
             <wp:effectExtent l="0" t="0" r="0" b="0"/>
             <wp:docPr id="17" name="14_testing" descr="Test detail — Test settings" title="Test detail — Test settings"/>
@@ -9428,7 +9428,7 @@
           <w:noProof/>
         </w:rPr>
         <w:drawing>
-          <wp:inline distT="0" distB="0" distL="0" distR="0" wp14:anchorId="0B408149" wp14:editId="44AC9261">
+          <wp:inline distT="0" distB="0" distL="0" distR="0" wp14:anchorId="59631B94" wp14:editId="4A25DF4C">
             <wp:extent cx="6124575" cy="3448050"/>
             <wp:effectExtent l="0" t="0" r="0" b="0"/>
             <wp:docPr id="18" name="17_test_results" descr="Test results" title="Test results"/>
@@ -9495,7 +9495,7 @@
       <w:pPr>
         <w:pStyle w:val="Nadpis2"/>
       </w:pPr>
-      <w:bookmarkStart w:id="25" w:name="_Toc242612449"/>
+      <w:bookmarkStart w:id="25" w:name="_Toc242625823"/>
       <w:r>
         <w:t>6.1  Signal data</w:t>
       </w:r>
@@ -9975,7 +9975,7 @@
           <w:noProof/>
         </w:rPr>
         <w:drawing>
-          <wp:inline distT="0" distB="0" distL="0" distR="0" wp14:anchorId="2B786A4E" wp14:editId="45930EB9">
+          <wp:inline distT="0" distB="0" distL="0" distR="0" wp14:anchorId="29F43AFB" wp14:editId="198776E5">
             <wp:extent cx="6124575" cy="3448050"/>
             <wp:effectExtent l="0" t="0" r="0" b="0"/>
             <wp:docPr id="19" name="20a_sig_overview" descr="Signal data — Overview" title="Signal data — Overview"/>
@@ -10049,7 +10049,7 @@
           <w:noProof/>
         </w:rPr>
         <w:drawing>
-          <wp:inline distT="0" distB="0" distL="0" distR="0" wp14:anchorId="35A8A7A0" wp14:editId="2233657E">
+          <wp:inline distT="0" distB="0" distL="0" distR="0" wp14:anchorId="7CE8DC25" wp14:editId="0C52770C">
             <wp:extent cx="6124575" cy="3448050"/>
             <wp:effectExtent l="0" t="0" r="0" b="0"/>
             <wp:docPr id="20" name="20d_sig_switching" descr="Signal data — Switching detail" title="Signal data — Switching detail"/>
@@ -10224,7 +10224,7 @@
       <w:pPr>
         <w:pStyle w:val="Nadpis2"/>
       </w:pPr>
-      <w:bookmarkStart w:id="26" w:name="_Toc242612450"/>
+      <w:bookmarkStart w:id="26" w:name="_Toc242625824"/>
       <w:r>
         <w:t>6.2  Printing a test report</w:t>
       </w:r>
@@ -10263,7 +10263,7 @@
         <w:pStyle w:val="Nadpis1"/>
         <w:pageBreakBefore/>
       </w:pPr>
-      <w:bookmarkStart w:id="27" w:name="_Toc242612451"/>
+      <w:bookmarkStart w:id="27" w:name="_Toc242625825"/>
       <w:r>
         <w:t>7  Settings</w:t>
       </w:r>
@@ -10273,7 +10273,7 @@
       <w:pPr>
         <w:pStyle w:val="Nadpis2"/>
       </w:pPr>
-      <w:bookmarkStart w:id="28" w:name="_Toc242612452"/>
+      <w:bookmarkStart w:id="28" w:name="_Toc242625826"/>
       <w:r>
         <w:t>7.1  Preferences</w:t>
       </w:r>
@@ -10298,7 +10298,7 @@
           <w:noProof/>
         </w:rPr>
         <w:drawing>
-          <wp:inline distT="0" distB="0" distL="0" distR="0" wp14:anchorId="28C94760" wp14:editId="4CC3F4FB">
+          <wp:inline distT="0" distB="0" distL="0" distR="0" wp14:anchorId="52ADC7B9" wp14:editId="6FD3DF2B">
             <wp:extent cx="6124575" cy="3448050"/>
             <wp:effectExtent l="0" t="0" r="0" b="0"/>
             <wp:docPr id="21" name="21_settings_prefs" descr="Settings — Preferences" title="Settings — Preferences"/>
@@ -10365,7 +10365,7 @@
       <w:pPr>
         <w:pStyle w:val="Nadpis2"/>
       </w:pPr>
-      <w:bookmarkStart w:id="29" w:name="_Toc242612453"/>
+      <w:bookmarkStart w:id="29" w:name="_Toc242625827"/>
       <w:r>
         <w:t>7.2  Connection</w:t>
       </w:r>
@@ -10390,7 +10390,7 @@
           <w:noProof/>
         </w:rPr>
         <w:drawing>
-          <wp:inline distT="0" distB="0" distL="0" distR="0" wp14:anchorId="149A297D" wp14:editId="79364DE3">
+          <wp:inline distT="0" distB="0" distL="0" distR="0" wp14:anchorId="2E256218" wp14:editId="6B30F4BA">
             <wp:extent cx="6124575" cy="3448050"/>
             <wp:effectExtent l="0" t="0" r="0" b="0"/>
             <wp:docPr id="22" name="22_settings_conn" descr="Settings — Connection" title="Settings — Connection"/>
@@ -10457,7 +10457,7 @@
       <w:pPr>
         <w:pStyle w:val="Nadpis2"/>
       </w:pPr>
-      <w:bookmarkStart w:id="30" w:name="_Toc242612454"/>
+      <w:bookmarkStart w:id="30" w:name="_Toc242625828"/>
       <w:r>
         <w:t>7.3  Users</w:t>
       </w:r>
@@ -10482,7 +10482,7 @@
           <w:noProof/>
         </w:rPr>
         <w:drawing>
-          <wp:inline distT="0" distB="0" distL="0" distR="0" wp14:anchorId="3357077C" wp14:editId="2CC6EA01">
+          <wp:inline distT="0" distB="0" distL="0" distR="0" wp14:anchorId="502984BF" wp14:editId="63D672EB">
             <wp:extent cx="6124575" cy="3448050"/>
             <wp:effectExtent l="0" t="0" r="0" b="0"/>
             <wp:docPr id="23" name="23_settings_users" descr="Settings — Users" title="Settings — Users"/>
@@ -10550,7 +10550,7 @@
         <w:pStyle w:val="Nadpis1"/>
         <w:pageBreakBefore/>
       </w:pPr>
-      <w:bookmarkStart w:id="31" w:name="_Toc242612455"/>
+      <w:bookmarkStart w:id="31" w:name="_Toc242625829"/>
       <w:r>
         <w:t>8  Info</w:t>
       </w:r>
@@ -10575,7 +10575,7 @@
           <w:noProof/>
         </w:rPr>
         <w:drawing>
-          <wp:inline distT="0" distB="0" distL="0" distR="0" wp14:anchorId="660BE68D" wp14:editId="7198A648">
+          <wp:inline distT="0" distB="0" distL="0" distR="0" wp14:anchorId="350391EA" wp14:editId="6501911A">
             <wp:extent cx="6124575" cy="3448050"/>
             <wp:effectExtent l="0" t="0" r="0" b="0"/>
             <wp:docPr id="24" name="24_info" descr="Info page" title="Info page"/>
@@ -10643,7 +10643,7 @@
         <w:pStyle w:val="Nadpis1"/>
         <w:pageBreakBefore/>
       </w:pPr>
-      <w:bookmarkStart w:id="32" w:name="_Toc242612456"/>
+      <w:bookmarkStart w:id="32" w:name="_Toc242625830"/>
       <w:r>
         <w:t>9  Common situations</w:t>
       </w:r>
@@ -11359,7 +11359,7 @@
         <w:pStyle w:val="Nadpis1"/>
         <w:pageBreakBefore/>
       </w:pPr>
-      <w:bookmarkStart w:id="33" w:name="_Toc242612457"/>
+      <w:bookmarkStart w:id="33" w:name="_Toc242625831"/>
       <w:r>
         <w:t>Appendix A  Parameter overview</w:t>
       </w:r>
@@ -12150,7 +12150,7 @@
                 <w:sz w:val="18"/>
                 <w:szCs w:val="18"/>
               </w:rPr>
-              <w:t>Position [µm] where the contact switches on the forward stroke — height above the mounting-hole axis. PT = FP − OP.</w:t>
+              <w:t>Position [µm] where the contact switches on the forward stroke — height above the mounting-hole axis. PT = FP − OP. Older files: encoder scale (increases when actuated).</w:t>
             </w:r>
           </w:p>
         </w:tc>
@@ -12245,7 +12245,7 @@
                 <w:sz w:val="18"/>
                 <w:szCs w:val="18"/>
               </w:rPr>
-              <w:t>Position [µm] where the contact releases on the return stroke — height above the mounting-hole axis. MD = RP − OP.</w:t>
+              <w:t>Position [µm] where the contact releases on the return stroke — height above the mounting-hole axis. MD = RP − OP. Older files: encoder scale (increases when actuated).</w:t>
             </w:r>
           </w:p>
         </w:tc>
@@ -12340,7 +12340,7 @@
                 <w:sz w:val="18"/>
                 <w:szCs w:val="18"/>
               </w:rPr>
-              <w:t>Position [µm] at the end of travel — the deepest point of actuation (height above the mounting-hole axis). TT = FP − TTP.</w:t>
+              <w:t>Position [µm] at the end of travel — the deepest point of actuation (height above the mounting-hole axis). TT = FP − TTP. Older files: encoder scale (increases when actuated).</w:t>
             </w:r>
           </w:p>
         </w:tc>
@@ -13755,7 +13755,7 @@
                 <w:sz w:val="18"/>
                 <w:szCs w:val="18"/>
               </w:rPr>
-              <w:t>Resistance [mΩ] of the normally closed (NC) contact at the operating point (OP), negative pole. High resistance = degradation. Above 999.9 mΩ = open (∞).</w:t>
+              <w:t>Resistance [mΩ] of the NC contact just before switching at OP (median over a 3 µm travel window) — NC is still closed, a low value is expected (a few mΩ). High resistance = worn or dirty contact.</w:t>
             </w:r>
           </w:p>
         </w:tc>
@@ -13850,7 +13850,7 @@
                 <w:sz w:val="18"/>
                 <w:szCs w:val="18"/>
               </w:rPr>
-              <w:t>Resistance [mΩ] of the NC contact at the operating point (OP), positive pole.</w:t>
+              <w:t>Resistance [mΩ] of the NC contact just after switching at OP — NC is already open, ∞ is expected (above 999.9 mΩ).</w:t>
             </w:r>
           </w:p>
         </w:tc>
@@ -13945,7 +13945,7 @@
                 <w:sz w:val="18"/>
                 <w:szCs w:val="18"/>
               </w:rPr>
-              <w:t>Resistance [mΩ] of the NC contact at the releasing point (RP), negative pole.</w:t>
+              <w:t>Resistance [mΩ] of the NC contact just before switching at RP (return stroke) — NC is still open, ∞ is expected (above 999.9 mΩ).</w:t>
             </w:r>
           </w:p>
         </w:tc>
@@ -14040,7 +14040,7 @@
                 <w:sz w:val="18"/>
                 <w:szCs w:val="18"/>
               </w:rPr>
-              <w:t>Resistance [mΩ] of the NC contact at the releasing point (RP), positive pole.</w:t>
+              <w:t>Resistance [mΩ] of the NC contact just after switching at RP — NC is closed again, a low value is expected (a few mΩ).</w:t>
             </w:r>
           </w:p>
         </w:tc>
@@ -14135,7 +14135,7 @@
                 <w:sz w:val="18"/>
                 <w:szCs w:val="18"/>
               </w:rPr>
-              <w:t>Resistance [mΩ] of the normally open (NO) contact at the operating point (OP), negative pole. Low resistance = properly closed.</w:t>
+              <w:t>Resistance [mΩ] of the NO contact just before switching at OP — NO is still open, ∞ is expected (above 999.9 mΩ).</w:t>
             </w:r>
           </w:p>
         </w:tc>
@@ -14230,7 +14230,7 @@
                 <w:sz w:val="18"/>
                 <w:szCs w:val="18"/>
               </w:rPr>
-              <w:t>Resistance [mΩ] of the NO contact at the operating point (OP), positive pole.</w:t>
+              <w:t>Resistance [mΩ] of the NO contact just after switching at OP (median over a 3 µm travel window) — NO is closed, a low value is expected (a few mΩ). High resistance = poorly closed contact.</w:t>
             </w:r>
           </w:p>
         </w:tc>
@@ -14325,7 +14325,7 @@
                 <w:sz w:val="18"/>
                 <w:szCs w:val="18"/>
               </w:rPr>
-              <w:t>Resistance [mΩ] of the NO contact at the releasing point (RP), negative pole.</w:t>
+              <w:t>Resistance [mΩ] of the NO contact just before switching at RP (return stroke) — NO is still closed, a low value is expected (a few mΩ).</w:t>
             </w:r>
           </w:p>
         </w:tc>
@@ -14420,7 +14420,7 @@
                 <w:sz w:val="18"/>
                 <w:szCs w:val="18"/>
               </w:rPr>
-              <w:t>Resistance [mΩ] of the NO contact at the releasing point (RP), positive pole.</w:t>
+              <w:t>Resistance [mΩ] of the NO contact just after switching at RP — NO is open, ∞ is expected (above 999.9 mΩ).</w:t>
             </w:r>
           </w:p>
         </w:tc>
@@ -14634,213 +14634,213 @@
 <file path=word/numbering.xml><?xml version="1.0" encoding="utf-8"?>
 <w:numbering xmlns:wpc="http://schemas.microsoft.com/office/word/2010/wordprocessingCanvas" xmlns:cx="http://schemas.microsoft.com/office/drawing/2014/chartex" xmlns:cx1="http://schemas.microsoft.com/office/drawing/2015/9/8/chartex" xmlns:cx2="http://schemas.microsoft.com/office/drawing/2015/10/21/chartex" xmlns:cx3="http://schemas.microsoft.com/office/drawing/2016/5/9/chartex" xmlns:cx4="http://schemas.microsoft.com/office/drawing/2016/5/10/chartex" xmlns:cx5="http://schemas.microsoft.com/office/drawing/2016/5/11/chartex" xmlns:cx6="http://schemas.microsoft.com/office/drawing/2016/5/12/chartex" xmlns:cx7="http://schemas.microsoft.com/office/drawing/2016/5/13/chartex" xmlns:cx8="http://schemas.microsoft.com/office/drawing/2016/5/14/chartex" xmlns:mc="http://schemas.openxmlformats.org/markup-compatibility/2006" xmlns:aink="http://schemas.microsoft.com/office/drawing/2016/ink" xmlns:am3d="http://schemas.microsoft.com/office/drawing/2017/model3d" xmlns:o="urn:schemas-microsoft-com:office:office" xmlns:oel="http://schemas.microsoft.com/office/2019/extlst" xmlns:r="http://schemas.openxmlformats.org/officeDocument/2006/relationships" xmlns:m="http://schemas.openxmlformats.org/officeDocument/2006/math" xmlns:v="urn:schemas-microsoft-com:vml" xmlns:wp14="http://schemas.microsoft.com/office/word/2010/wordprocessingDrawing" xmlns:wp="http://schemas.openxmlformats.org/drawingml/2006/wordprocessingDrawing" xmlns:w10="urn:schemas-microsoft-com:office:word" xmlns:w="http://schemas.openxmlformats.org/wordprocessingml/2006/main" xmlns:w14="http://schemas.microsoft.com/office/word/2010/wordml" xmlns:w15="http://schemas.microsoft.com/office/word/2012/wordml" xmlns:w16cex="http://schemas.microsoft.com/office/word/2018/wordml/cex" xmlns:w16cid="http://schemas.microsoft.com/office/word/2016/wordml/cid" xmlns:w16="http://schemas.microsoft.com/office/word/2018/wordml" xmlns:w16du="http://schemas.microsoft.com/office/word/2023/wordml/word16du" xmlns:w16sdtdh="http://schemas.microsoft.com/office/word/2020/wordml/sdtdatahash" xmlns:w16sdtfl="http://schemas.microsoft.com/office/word/2024/wordml/sdtformatlock" xmlns:w16se="http://schemas.microsoft.com/office/word/2015/wordml/symex" xmlns:wpg="http://schemas.microsoft.com/office/word/2010/wordprocessingGroup" xmlns:wpi="http://schemas.microsoft.com/office/word/2010/wordprocessingInk" xmlns:wne="http://schemas.microsoft.com/office/word/2006/wordml" xmlns:wps="http://schemas.microsoft.com/office/word/2010/wordprocessingShape" mc:Ignorable="w14 w15 w16se w16cid w16 w16cex w16sdtdh w16sdtfl w16du wp14">
   <w:abstractNum w:abstractNumId="0" w15:restartNumberingAfterBreak="0">
-    <w:nsid w:val="268325AA"/>
+    <w:nsid w:val="397927AB"/>
     <w:multiLevelType w:val="hybridMultilevel"/>
-    <w:tmpl w:val="3D02C414"/>
-    <w:lvl w:ilvl="0" w:tplc="C56AFA5C">
+    <w:tmpl w:val="E5F81A6A"/>
+    <w:lvl w:ilvl="0" w:tplc="BB6CD1A0">
       <w:start w:val="1"/>
-      <w:numFmt w:val="bullet"/>
-      <w:lvlText w:val="•"/>
+      <w:numFmt w:val="decimal"/>
+      <w:lvlText w:val="%1."/>
       <w:lvlJc w:val="left"/>
       <w:pPr>
-        <w:ind w:left="540" w:hanging="270"/>
+        <w:ind w:left="540" w:hanging="300"/>
       </w:pPr>
     </w:lvl>
-    <w:lvl w:ilvl="1" w:tplc="575A7172">
+    <w:lvl w:ilvl="1" w:tplc="A5705A2C">
       <w:numFmt w:val="decimal"/>
       <w:lvlText w:val=""/>
       <w:lvlJc w:val="left"/>
     </w:lvl>
-    <w:lvl w:ilvl="2" w:tplc="9C7E0664">
+    <w:lvl w:ilvl="2" w:tplc="DF508060">
       <w:numFmt w:val="decimal"/>
       <w:lvlText w:val=""/>
       <w:lvlJc w:val="left"/>
     </w:lvl>
-    <w:lvl w:ilvl="3" w:tplc="7BC24DCC">
+    <w:lvl w:ilvl="3" w:tplc="7BAAC1BA">
       <w:numFmt w:val="decimal"/>
       <w:lvlText w:val=""/>
       <w:lvlJc w:val="left"/>
     </w:lvl>
-    <w:lvl w:ilvl="4" w:tplc="0F34B644">
+    <w:lvl w:ilvl="4" w:tplc="AEA2FE04">
       <w:numFmt w:val="decimal"/>
       <w:lvlText w:val=""/>
       <w:lvlJc w:val="left"/>
     </w:lvl>
-    <w:lvl w:ilvl="5" w:tplc="BF280F12">
+    <w:lvl w:ilvl="5" w:tplc="79C88CDE">
       <w:numFmt w:val="decimal"/>
       <w:lvlText w:val=""/>
       <w:lvlJc w:val="left"/>
     </w:lvl>
-    <w:lvl w:ilvl="6" w:tplc="7F767490">
+    <w:lvl w:ilvl="6" w:tplc="9FFC29EC">
       <w:numFmt w:val="decimal"/>
       <w:lvlText w:val=""/>
       <w:lvlJc w:val="left"/>
     </w:lvl>
-    <w:lvl w:ilvl="7" w:tplc="4CE2D8B0">
+    <w:lvl w:ilvl="7" w:tplc="8FD0BC2E">
       <w:numFmt w:val="decimal"/>
       <w:lvlText w:val=""/>
       <w:lvlJc w:val="left"/>
     </w:lvl>
-    <w:lvl w:ilvl="8" w:tplc="7E8E97FE">
+    <w:lvl w:ilvl="8" w:tplc="DA6A9D06">
       <w:numFmt w:val="decimal"/>
       <w:lvlText w:val=""/>
       <w:lvlJc w:val="left"/>
     </w:lvl>
   </w:abstractNum>
   <w:abstractNum w:abstractNumId="1" w15:restartNumberingAfterBreak="0">
-    <w:nsid w:val="4E902C9D"/>
+    <w:nsid w:val="449551EF"/>
     <w:multiLevelType w:val="hybridMultilevel"/>
-    <w:tmpl w:val="CE1810BC"/>
-    <w:lvl w:ilvl="0" w:tplc="41886278" w:tentative="1">
+    <w:tmpl w:val="F784210A"/>
+    <w:lvl w:ilvl="0" w:tplc="D9E494A4">
       <w:start w:val="1"/>
       <w:numFmt w:val="bullet"/>
-      <w:lvlText w:val="●"/>
+      <w:lvlText w:val="•"/>
       <w:lvlJc w:val="left"/>
       <w:pPr>
-        <w:ind w:left="720" w:hanging="360"/>
+        <w:ind w:left="540" w:hanging="270"/>
       </w:pPr>
     </w:lvl>
-    <w:lvl w:ilvl="1" w:tplc="EE4A13DA" w:tentative="1">
-      <w:start w:val="1"/>
-      <w:numFmt w:val="bullet"/>
-      <w:lvlText w:val="○"/>
-      <w:lvlJc w:val="left"/>
-      <w:pPr>
-        <w:ind w:left="1440" w:hanging="360"/>
-      </w:pPr>
-    </w:lvl>
-    <w:lvl w:ilvl="2" w:tplc="120EE6B6" w:tentative="1">
-      <w:start w:val="1"/>
-      <w:numFmt w:val="bullet"/>
-      <w:lvlText w:val="■"/>
-      <w:lvlJc w:val="left"/>
-      <w:pPr>
-        <w:ind w:left="2160" w:hanging="360"/>
-      </w:pPr>
-    </w:lvl>
-    <w:lvl w:ilvl="3" w:tplc="8B9EB91C" w:tentative="1">
-      <w:start w:val="1"/>
-      <w:numFmt w:val="bullet"/>
-      <w:lvlText w:val="●"/>
-      <w:lvlJc w:val="left"/>
-      <w:pPr>
-        <w:ind w:left="2880" w:hanging="360"/>
-      </w:pPr>
-    </w:lvl>
-    <w:lvl w:ilvl="4" w:tplc="FD7E8C0C" w:tentative="1">
-      <w:start w:val="1"/>
-      <w:numFmt w:val="bullet"/>
-      <w:lvlText w:val="○"/>
-      <w:lvlJc w:val="left"/>
-      <w:pPr>
-        <w:ind w:left="3600" w:hanging="360"/>
-      </w:pPr>
-    </w:lvl>
-    <w:lvl w:ilvl="5" w:tplc="51709D5A" w:tentative="1">
-      <w:start w:val="1"/>
-      <w:numFmt w:val="bullet"/>
-      <w:lvlText w:val="■"/>
-      <w:lvlJc w:val="left"/>
-      <w:pPr>
-        <w:ind w:left="4320" w:hanging="360"/>
-      </w:pPr>
-    </w:lvl>
-    <w:lvl w:ilvl="6" w:tplc="0A6AF486" w:tentative="1">
-      <w:start w:val="1"/>
-      <w:numFmt w:val="bullet"/>
-      <w:lvlText w:val="●"/>
-      <w:lvlJc w:val="left"/>
-      <w:pPr>
-        <w:ind w:left="5040" w:hanging="360"/>
-      </w:pPr>
-    </w:lvl>
-    <w:lvl w:ilvl="7" w:tplc="57D03BB6" w:tentative="1">
-      <w:start w:val="1"/>
-      <w:numFmt w:val="bullet"/>
-      <w:lvlText w:val="●"/>
-      <w:lvlJc w:val="left"/>
-      <w:pPr>
-        <w:ind w:left="5760" w:hanging="360"/>
-      </w:pPr>
-    </w:lvl>
-    <w:lvl w:ilvl="8" w:tplc="0AF80B20" w:tentative="1">
-      <w:start w:val="1"/>
-      <w:numFmt w:val="bullet"/>
-      <w:lvlText w:val="●"/>
-      <w:lvlJc w:val="left"/>
-      <w:pPr>
-        <w:ind w:left="6480" w:hanging="360"/>
-      </w:pPr>
-    </w:lvl>
-  </w:abstractNum>
-  <w:abstractNum w:abstractNumId="2" w15:restartNumberingAfterBreak="0">
-    <w:nsid w:val="7D2C47BA"/>
-    <w:multiLevelType w:val="hybridMultilevel"/>
-    <w:tmpl w:val="B818214C"/>
-    <w:lvl w:ilvl="0" w:tplc="C9FEB734">
-      <w:start w:val="1"/>
-      <w:numFmt w:val="decimal"/>
-      <w:lvlText w:val="%1."/>
-      <w:lvlJc w:val="left"/>
-      <w:pPr>
-        <w:ind w:left="540" w:hanging="300"/>
-      </w:pPr>
-    </w:lvl>
-    <w:lvl w:ilvl="1" w:tplc="DC2E7130">
+    <w:lvl w:ilvl="1" w:tplc="CA90A944">
       <w:numFmt w:val="decimal"/>
       <w:lvlText w:val=""/>
       <w:lvlJc w:val="left"/>
     </w:lvl>
-    <w:lvl w:ilvl="2" w:tplc="C270F23E">
+    <w:lvl w:ilvl="2" w:tplc="484AB2D6">
       <w:numFmt w:val="decimal"/>
       <w:lvlText w:val=""/>
       <w:lvlJc w:val="left"/>
     </w:lvl>
-    <w:lvl w:ilvl="3" w:tplc="B5E81910">
+    <w:lvl w:ilvl="3" w:tplc="620030C0">
       <w:numFmt w:val="decimal"/>
       <w:lvlText w:val=""/>
       <w:lvlJc w:val="left"/>
     </w:lvl>
-    <w:lvl w:ilvl="4" w:tplc="DC3EDE06">
+    <w:lvl w:ilvl="4" w:tplc="BC64D5BA">
       <w:numFmt w:val="decimal"/>
       <w:lvlText w:val=""/>
       <w:lvlJc w:val="left"/>
     </w:lvl>
-    <w:lvl w:ilvl="5" w:tplc="3A7AE3D2">
+    <w:lvl w:ilvl="5" w:tplc="CC128E58">
       <w:numFmt w:val="decimal"/>
       <w:lvlText w:val=""/>
       <w:lvlJc w:val="left"/>
     </w:lvl>
-    <w:lvl w:ilvl="6" w:tplc="AF6685DC">
+    <w:lvl w:ilvl="6" w:tplc="551A59E0">
       <w:numFmt w:val="decimal"/>
       <w:lvlText w:val=""/>
       <w:lvlJc w:val="left"/>
     </w:lvl>
-    <w:lvl w:ilvl="7" w:tplc="C63C9686">
+    <w:lvl w:ilvl="7" w:tplc="51DA6EAC">
       <w:numFmt w:val="decimal"/>
       <w:lvlText w:val=""/>
       <w:lvlJc w:val="left"/>
     </w:lvl>
-    <w:lvl w:ilvl="8" w:tplc="FBF2F9DA">
+    <w:lvl w:ilvl="8" w:tplc="53369486">
       <w:numFmt w:val="decimal"/>
       <w:lvlText w:val=""/>
       <w:lvlJc w:val="left"/>
     </w:lvl>
   </w:abstractNum>
-  <w:num w:numId="1" w16cid:durableId="1385956361">
+  <w:abstractNum w:abstractNumId="2" w15:restartNumberingAfterBreak="0">
+    <w:nsid w:val="5E2C7E26"/>
+    <w:multiLevelType w:val="hybridMultilevel"/>
+    <w:tmpl w:val="892A9C14"/>
+    <w:lvl w:ilvl="0" w:tplc="4A46C608" w:tentative="1">
+      <w:start w:val="1"/>
+      <w:numFmt w:val="bullet"/>
+      <w:lvlText w:val="●"/>
+      <w:lvlJc w:val="left"/>
+      <w:pPr>
+        <w:ind w:left="720" w:hanging="360"/>
+      </w:pPr>
+    </w:lvl>
+    <w:lvl w:ilvl="1" w:tplc="C8ACE406" w:tentative="1">
+      <w:start w:val="1"/>
+      <w:numFmt w:val="bullet"/>
+      <w:lvlText w:val="○"/>
+      <w:lvlJc w:val="left"/>
+      <w:pPr>
+        <w:ind w:left="1440" w:hanging="360"/>
+      </w:pPr>
+    </w:lvl>
+    <w:lvl w:ilvl="2" w:tplc="4134FAD8" w:tentative="1">
+      <w:start w:val="1"/>
+      <w:numFmt w:val="bullet"/>
+      <w:lvlText w:val="■"/>
+      <w:lvlJc w:val="left"/>
+      <w:pPr>
+        <w:ind w:left="2160" w:hanging="360"/>
+      </w:pPr>
+    </w:lvl>
+    <w:lvl w:ilvl="3" w:tplc="EFE6D2AE" w:tentative="1">
+      <w:start w:val="1"/>
+      <w:numFmt w:val="bullet"/>
+      <w:lvlText w:val="●"/>
+      <w:lvlJc w:val="left"/>
+      <w:pPr>
+        <w:ind w:left="2880" w:hanging="360"/>
+      </w:pPr>
+    </w:lvl>
+    <w:lvl w:ilvl="4" w:tplc="D4543DFE" w:tentative="1">
+      <w:start w:val="1"/>
+      <w:numFmt w:val="bullet"/>
+      <w:lvlText w:val="○"/>
+      <w:lvlJc w:val="left"/>
+      <w:pPr>
+        <w:ind w:left="3600" w:hanging="360"/>
+      </w:pPr>
+    </w:lvl>
+    <w:lvl w:ilvl="5" w:tplc="8F8C506E" w:tentative="1">
+      <w:start w:val="1"/>
+      <w:numFmt w:val="bullet"/>
+      <w:lvlText w:val="■"/>
+      <w:lvlJc w:val="left"/>
+      <w:pPr>
+        <w:ind w:left="4320" w:hanging="360"/>
+      </w:pPr>
+    </w:lvl>
+    <w:lvl w:ilvl="6" w:tplc="F8D0E45C" w:tentative="1">
+      <w:start w:val="1"/>
+      <w:numFmt w:val="bullet"/>
+      <w:lvlText w:val="●"/>
+      <w:lvlJc w:val="left"/>
+      <w:pPr>
+        <w:ind w:left="5040" w:hanging="360"/>
+      </w:pPr>
+    </w:lvl>
+    <w:lvl w:ilvl="7" w:tplc="1B722A0C" w:tentative="1">
+      <w:start w:val="1"/>
+      <w:numFmt w:val="bullet"/>
+      <w:lvlText w:val="●"/>
+      <w:lvlJc w:val="left"/>
+      <w:pPr>
+        <w:ind w:left="5760" w:hanging="360"/>
+      </w:pPr>
+    </w:lvl>
+    <w:lvl w:ilvl="8" w:tplc="7E108B36" w:tentative="1">
+      <w:start w:val="1"/>
+      <w:numFmt w:val="bullet"/>
+      <w:lvlText w:val="●"/>
+      <w:lvlJc w:val="left"/>
+      <w:pPr>
+        <w:ind w:left="6480" w:hanging="360"/>
+      </w:pPr>
+    </w:lvl>
+  </w:abstractNum>
+  <w:num w:numId="1" w16cid:durableId="794102372">
+    <w:abstractNumId w:val="2"/>
+    <w:lvlOverride w:ilvl="0">
+      <w:startOverride w:val="1"/>
+    </w:lvlOverride>
+  </w:num>
+  <w:num w:numId="2" w16cid:durableId="330642622">
     <w:abstractNumId w:val="1"/>
     <w:lvlOverride w:ilvl="0">
       <w:startOverride w:val="1"/>
     </w:lvlOverride>
   </w:num>
-  <w:num w:numId="2" w16cid:durableId="1322737163">
+  <w:num w:numId="3" w16cid:durableId="1593274072">
     <w:abstractNumId w:val="0"/>
-    <w:lvlOverride w:ilvl="0">
-      <w:startOverride w:val="1"/>
-    </w:lvlOverride>
-  </w:num>
-  <w:num w:numId="3" w16cid:durableId="730882622">
-    <w:abstractNumId w:val="2"/>
     <w:lvlOverride w:ilvl="0">
       <w:startOverride w:val="1"/>
     </w:lvlOverride>
@@ -15475,7 +15475,7 @@
     <w:autoRedefine/>
     <w:uiPriority w:val="39"/>
     <w:unhideWhenUsed/>
-    <w:rsid w:val="00E37EA4"/>
+    <w:rsid w:val="0082693C"/>
     <w:pPr>
       <w:spacing w:after="100"/>
     </w:pPr>
@@ -15487,7 +15487,7 @@
     <w:autoRedefine/>
     <w:uiPriority w:val="39"/>
     <w:unhideWhenUsed/>
-    <w:rsid w:val="00E37EA4"/>
+    <w:rsid w:val="0082693C"/>
     <w:pPr>
       <w:spacing w:after="100"/>
       <w:ind w:left="200"/>

</xml_diff>